<commit_message>
Annotations and solid principles
</commit_message>
<xml_diff>
--- a/note/Annotation in Spring.docx
+++ b/note/Annotation in Spring.docx
@@ -5,11 +5,17 @@
     <w:p>
       <w:pPr>
         <w:rPr>
-          <w:lang w:val="en-GB"/>
-        </w:rPr>
-      </w:pPr>
-      <w:r>
-        <w:rPr>
+          <w:rFonts w:asciiTheme="majorHAnsi" w:hAnsiTheme="majorHAnsi"/>
+          <w:sz w:val="24"/>
+          <w:szCs w:val="24"/>
+          <w:lang w:val="en-GB"/>
+        </w:rPr>
+      </w:pPr>
+      <w:r>
+        <w:rPr>
+          <w:rFonts w:asciiTheme="majorHAnsi" w:hAnsiTheme="majorHAnsi"/>
+          <w:sz w:val="24"/>
+          <w:szCs w:val="24"/>
           <w:lang w:val="en-GB"/>
         </w:rPr>
         <w:t>Annotations for Spring/Spring Boot</w:t>
@@ -23,11 +29,59 @@
           <w:numId w:val="3"/>
         </w:numPr>
         <w:rPr>
-          <w:lang w:val="en-GB"/>
-        </w:rPr>
-      </w:pPr>
-      <w:r>
-        <w:rPr>
+          <w:rFonts w:asciiTheme="majorHAnsi" w:hAnsiTheme="majorHAnsi"/>
+          <w:sz w:val="24"/>
+          <w:szCs w:val="24"/>
+          <w:lang w:val="en-GB"/>
+        </w:rPr>
+      </w:pPr>
+      <w:r>
+        <w:rPr>
+          <w:rFonts w:asciiTheme="majorHAnsi" w:hAnsiTheme="majorHAnsi"/>
+          <w:sz w:val="24"/>
+          <w:szCs w:val="24"/>
+          <w:lang w:val="en-GB"/>
+        </w:rPr>
+        <w:t>@Access: used for defining the access type of either field or property.</w:t>
+      </w:r>
+      <w:r>
+        <w:rPr>
+          <w:rFonts w:asciiTheme="majorHAnsi" w:hAnsiTheme="majorHAnsi"/>
+          <w:sz w:val="24"/>
+          <w:szCs w:val="24"/>
+          <w:lang w:val="en-GB"/>
+        </w:rPr>
+        <w:t xml:space="preserve"> </w:t>
+      </w:r>
+      <w:r>
+        <w:rPr>
+          <w:rFonts w:asciiTheme="majorHAnsi" w:hAnsiTheme="majorHAnsi"/>
+          <w:sz w:val="24"/>
+          <w:szCs w:val="24"/>
+          <w:lang w:val="en-GB"/>
+        </w:rPr>
+        <w:t>Default value is field.</w:t>
+      </w:r>
+    </w:p>
+    <w:p>
+      <w:pPr>
+        <w:pStyle w:val="ListParagraph"/>
+        <w:numPr>
+          <w:ilvl w:val="0"/>
+          <w:numId w:val="3"/>
+        </w:numPr>
+        <w:rPr>
+          <w:rFonts w:asciiTheme="majorHAnsi" w:hAnsiTheme="majorHAnsi"/>
+          <w:sz w:val="24"/>
+          <w:szCs w:val="24"/>
+          <w:lang w:val="en-GB"/>
+        </w:rPr>
+      </w:pPr>
+      <w:r>
+        <w:rPr>
+          <w:rFonts w:asciiTheme="majorHAnsi" w:hAnsiTheme="majorHAnsi"/>
+          <w:sz w:val="24"/>
+          <w:szCs w:val="24"/>
           <w:lang w:val="en-GB"/>
         </w:rPr>
         <w:t>@</w:t>
@@ -35,11 +89,70 @@
       <w:proofErr w:type="spellStart"/>
       <w:r>
         <w:rPr>
-          <w:lang w:val="en-GB"/>
-        </w:rPr>
-        <w:t>AutoWired</w:t>
-      </w:r>
-      <w:proofErr w:type="spellEnd"/>
+          <w:rFonts w:asciiTheme="majorHAnsi" w:hAnsiTheme="majorHAnsi"/>
+          <w:sz w:val="24"/>
+          <w:szCs w:val="24"/>
+          <w:lang w:val="en-GB"/>
+        </w:rPr>
+        <w:t>Autow</w:t>
+      </w:r>
+      <w:r>
+        <w:rPr>
+          <w:rFonts w:asciiTheme="majorHAnsi" w:hAnsiTheme="majorHAnsi"/>
+          <w:sz w:val="24"/>
+          <w:szCs w:val="24"/>
+          <w:lang w:val="en-GB"/>
+        </w:rPr>
+        <w:t>ired</w:t>
+      </w:r>
+      <w:proofErr w:type="spellEnd"/>
+      <w:r>
+        <w:rPr>
+          <w:rFonts w:asciiTheme="majorHAnsi" w:hAnsiTheme="majorHAnsi"/>
+          <w:sz w:val="24"/>
+          <w:szCs w:val="24"/>
+          <w:lang w:val="en-GB"/>
+        </w:rPr>
+        <w:t xml:space="preserve">: </w:t>
+      </w:r>
+      <w:proofErr w:type="spellStart"/>
+      <w:r>
+        <w:rPr>
+          <w:rFonts w:asciiTheme="majorHAnsi" w:hAnsiTheme="majorHAnsi"/>
+          <w:sz w:val="24"/>
+          <w:szCs w:val="24"/>
+          <w:lang w:val="en-GB"/>
+        </w:rPr>
+        <w:t>Autowiring</w:t>
+      </w:r>
+      <w:proofErr w:type="spellEnd"/>
+      <w:r>
+        <w:rPr>
+          <w:rFonts w:asciiTheme="majorHAnsi" w:hAnsiTheme="majorHAnsi"/>
+          <w:sz w:val="24"/>
+          <w:szCs w:val="24"/>
+          <w:lang w:val="en-GB"/>
+        </w:rPr>
+        <w:t xml:space="preserve"> is used for automatic dependency injection. In other words it enables us to inject the object dependency implicitly.</w:t>
+      </w:r>
+      <w:r>
+        <w:rPr>
+          <w:rFonts w:asciiTheme="majorHAnsi" w:hAnsiTheme="majorHAnsi"/>
+          <w:sz w:val="24"/>
+          <w:szCs w:val="24"/>
+          <w:lang w:val="en-GB"/>
+        </w:rPr>
+        <w:t xml:space="preserve"> </w:t>
+      </w:r>
+      <w:r>
+        <w:rPr>
+          <w:rFonts w:asciiTheme="majorHAnsi" w:hAnsiTheme="majorHAnsi"/>
+          <w:sz w:val="24"/>
+          <w:szCs w:val="24"/>
+          <w:lang w:val="en-GB"/>
+        </w:rPr>
+        <w:t>It internally uses setter or constructor injection</w:t>
+      </w:r>
     </w:p>
     <w:p>
       <w:pPr>
@@ -49,15 +162,79 @@
           <w:numId w:val="3"/>
         </w:numPr>
         <w:rPr>
-          <w:lang w:val="en-GB"/>
-        </w:rPr>
-      </w:pPr>
-      <w:r>
-        <w:rPr>
+          <w:rFonts w:asciiTheme="majorHAnsi" w:hAnsiTheme="majorHAnsi"/>
+          <w:sz w:val="24"/>
+          <w:szCs w:val="24"/>
+          <w:lang w:val="en-GB"/>
+        </w:rPr>
+      </w:pPr>
+      <w:r>
+        <w:rPr>
+          <w:rFonts w:asciiTheme="majorHAnsi" w:hAnsiTheme="majorHAnsi"/>
+          <w:sz w:val="24"/>
+          <w:szCs w:val="24"/>
           <w:lang w:val="en-GB"/>
         </w:rPr>
         <w:t>@Bean</w:t>
       </w:r>
+      <w:r>
+        <w:rPr>
+          <w:rFonts w:asciiTheme="majorHAnsi" w:hAnsiTheme="majorHAnsi"/>
+          <w:sz w:val="24"/>
+          <w:szCs w:val="24"/>
+          <w:lang w:val="en-GB"/>
+        </w:rPr>
+        <w:t xml:space="preserve">: </w:t>
+      </w:r>
+      <w:r>
+        <w:rPr>
+          <w:rFonts w:asciiTheme="majorHAnsi" w:hAnsiTheme="majorHAnsi"/>
+          <w:sz w:val="24"/>
+          <w:szCs w:val="24"/>
+          <w:lang w:val="en-GB"/>
+        </w:rPr>
+        <w:t xml:space="preserve">It is a method level </w:t>
+      </w:r>
+      <w:proofErr w:type="spellStart"/>
+      <w:r>
+        <w:rPr>
+          <w:rFonts w:asciiTheme="majorHAnsi" w:hAnsiTheme="majorHAnsi"/>
+          <w:sz w:val="24"/>
+          <w:szCs w:val="24"/>
+          <w:lang w:val="en-GB"/>
+        </w:rPr>
+        <w:t>annotation.It</w:t>
+      </w:r>
+      <w:proofErr w:type="spellEnd"/>
+      <w:r>
+        <w:rPr>
+          <w:rFonts w:asciiTheme="majorHAnsi" w:hAnsiTheme="majorHAnsi"/>
+          <w:sz w:val="24"/>
+          <w:szCs w:val="24"/>
+          <w:lang w:val="en-GB"/>
+        </w:rPr>
+        <w:t xml:space="preserve"> tells that a method produces a bean to be managed by the </w:t>
+      </w:r>
+      <w:proofErr w:type="gramStart"/>
+      <w:r>
+        <w:rPr>
+          <w:rFonts w:asciiTheme="majorHAnsi" w:hAnsiTheme="majorHAnsi"/>
+          <w:sz w:val="24"/>
+          <w:szCs w:val="24"/>
+          <w:lang w:val="en-GB"/>
+        </w:rPr>
+        <w:t>Spring</w:t>
+      </w:r>
+      <w:proofErr w:type="gramEnd"/>
+      <w:r>
+        <w:rPr>
+          <w:rFonts w:asciiTheme="majorHAnsi" w:hAnsiTheme="majorHAnsi"/>
+          <w:sz w:val="24"/>
+          <w:szCs w:val="24"/>
+          <w:lang w:val="en-GB"/>
+        </w:rPr>
+        <w:t xml:space="preserve"> container.</w:t>
+      </w:r>
     </w:p>
     <w:p>
       <w:pPr>
@@ -67,15 +244,95 @@
           <w:numId w:val="3"/>
         </w:numPr>
         <w:rPr>
-          <w:lang w:val="en-GB"/>
-        </w:rPr>
-      </w:pPr>
-      <w:r>
-        <w:rPr>
+          <w:rFonts w:asciiTheme="majorHAnsi" w:hAnsiTheme="majorHAnsi"/>
+          <w:sz w:val="24"/>
+          <w:szCs w:val="24"/>
+          <w:lang w:val="en-GB"/>
+        </w:rPr>
+      </w:pPr>
+      <w:r>
+        <w:rPr>
+          <w:rFonts w:asciiTheme="majorHAnsi" w:hAnsiTheme="majorHAnsi"/>
+          <w:sz w:val="24"/>
+          <w:szCs w:val="24"/>
           <w:lang w:val="en-GB"/>
         </w:rPr>
         <w:t>@Component</w:t>
       </w:r>
+      <w:r>
+        <w:rPr>
+          <w:rFonts w:asciiTheme="majorHAnsi" w:hAnsiTheme="majorHAnsi"/>
+          <w:sz w:val="24"/>
+          <w:szCs w:val="24"/>
+          <w:lang w:val="en-GB"/>
+        </w:rPr>
+        <w:t xml:space="preserve">: </w:t>
+      </w:r>
+      <w:r>
+        <w:rPr>
+          <w:rFonts w:asciiTheme="majorHAnsi" w:hAnsiTheme="majorHAnsi"/>
+          <w:sz w:val="24"/>
+          <w:szCs w:val="24"/>
+          <w:lang w:val="en-GB"/>
+        </w:rPr>
+        <w:t>It is class level annotation. It marks a java class as a bean so that component scanning mechanism can pull it up can be used by Spring IOC container.</w:t>
+      </w:r>
+      <w:r>
+        <w:rPr>
+          <w:rFonts w:asciiTheme="majorHAnsi" w:hAnsiTheme="majorHAnsi"/>
+          <w:sz w:val="24"/>
+          <w:szCs w:val="24"/>
+          <w:lang w:val="en-GB"/>
+        </w:rPr>
+        <w:t xml:space="preserve"> </w:t>
+      </w:r>
+      <w:r>
+        <w:rPr>
+          <w:rFonts w:asciiTheme="majorHAnsi" w:hAnsiTheme="majorHAnsi"/>
+          <w:sz w:val="24"/>
+          <w:szCs w:val="24"/>
+          <w:lang w:val="en-GB"/>
+        </w:rPr>
+        <w:t xml:space="preserve">It auto detects and auto configures the beans using </w:t>
+      </w:r>
+      <w:proofErr w:type="spellStart"/>
+      <w:r>
+        <w:rPr>
+          <w:rFonts w:asciiTheme="majorHAnsi" w:hAnsiTheme="majorHAnsi"/>
+          <w:sz w:val="24"/>
+          <w:szCs w:val="24"/>
+          <w:lang w:val="en-GB"/>
+        </w:rPr>
+        <w:t>classpath</w:t>
+      </w:r>
+      <w:proofErr w:type="spellEnd"/>
+      <w:r>
+        <w:rPr>
+          <w:rFonts w:asciiTheme="majorHAnsi" w:hAnsiTheme="majorHAnsi"/>
+          <w:sz w:val="24"/>
+          <w:szCs w:val="24"/>
+          <w:lang w:val="en-GB"/>
+        </w:rPr>
+        <w:t xml:space="preserve"> scanning. </w:t>
+      </w:r>
+      <w:r>
+        <w:rPr>
+          <w:rFonts w:asciiTheme="majorHAnsi" w:hAnsiTheme="majorHAnsi"/>
+          <w:sz w:val="24"/>
+          <w:szCs w:val="24"/>
+          <w:lang w:val="en-GB"/>
+        </w:rPr>
+        <w:t xml:space="preserve"> </w:t>
+      </w:r>
+      <w:r>
+        <w:rPr>
+          <w:rFonts w:asciiTheme="majorHAnsi" w:hAnsiTheme="majorHAnsi"/>
+          <w:sz w:val="24"/>
+          <w:szCs w:val="24"/>
+          <w:lang w:val="en-GB"/>
+        </w:rPr>
+        <w:t>It has different specializations like @Controller, @Repository and @Service.</w:t>
+      </w:r>
     </w:p>
     <w:p>
       <w:pPr>
@@ -85,11 +342,18 @@
           <w:numId w:val="3"/>
         </w:numPr>
         <w:rPr>
-          <w:lang w:val="en-GB"/>
-        </w:rPr>
-      </w:pPr>
-      <w:r>
-        <w:rPr>
+          <w:rFonts w:asciiTheme="majorHAnsi" w:hAnsiTheme="majorHAnsi"/>
+          <w:sz w:val="24"/>
+          <w:szCs w:val="24"/>
+          <w:lang w:val="en-GB"/>
+        </w:rPr>
+      </w:pPr>
+      <w:proofErr w:type="gramStart"/>
+      <w:r>
+        <w:rPr>
+          <w:rFonts w:asciiTheme="majorHAnsi" w:hAnsiTheme="majorHAnsi"/>
+          <w:sz w:val="24"/>
+          <w:szCs w:val="24"/>
           <w:lang w:val="en-GB"/>
         </w:rPr>
         <w:t>@</w:t>
@@ -97,6 +361,9 @@
       <w:proofErr w:type="spellStart"/>
       <w:r>
         <w:rPr>
+          <w:rFonts w:asciiTheme="majorHAnsi" w:hAnsiTheme="majorHAnsi"/>
+          <w:sz w:val="24"/>
+          <w:szCs w:val="24"/>
           <w:lang w:val="en-GB"/>
         </w:rPr>
         <w:t>ComponentScan</w:t>
@@ -104,13 +371,20 @@
       <w:proofErr w:type="spellEnd"/>
       <w:r>
         <w:rPr>
+          <w:rFonts w:asciiTheme="majorHAnsi" w:hAnsiTheme="majorHAnsi"/>
+          <w:sz w:val="24"/>
+          <w:szCs w:val="24"/>
           <w:lang w:val="en-GB"/>
         </w:rPr>
         <w:t>(</w:t>
       </w:r>
       <w:proofErr w:type="spellStart"/>
-      <w:r>
-        <w:rPr>
+      <w:proofErr w:type="gramEnd"/>
+      <w:r>
+        <w:rPr>
+          <w:rFonts w:asciiTheme="majorHAnsi" w:hAnsiTheme="majorHAnsi"/>
+          <w:sz w:val="24"/>
+          <w:szCs w:val="24"/>
           <w:lang w:val="en-GB"/>
         </w:rPr>
         <w:t>basePackages</w:t>
@@ -118,10 +392,40 @@
       <w:proofErr w:type="spellEnd"/>
       <w:r>
         <w:rPr>
+          <w:rFonts w:asciiTheme="majorHAnsi" w:hAnsiTheme="majorHAnsi"/>
+          <w:sz w:val="24"/>
+          <w:szCs w:val="24"/>
           <w:lang w:val="en-GB"/>
         </w:rPr>
         <w:t xml:space="preserve"> = "package name") </w:t>
       </w:r>
+      <w:r>
+        <w:rPr>
+          <w:rFonts w:asciiTheme="majorHAnsi" w:hAnsiTheme="majorHAnsi"/>
+          <w:sz w:val="24"/>
+          <w:szCs w:val="24"/>
+          <w:lang w:val="en-GB"/>
+        </w:rPr>
+        <w:t xml:space="preserve">: </w:t>
+      </w:r>
+      <w:r>
+        <w:rPr>
+          <w:rFonts w:asciiTheme="majorHAnsi" w:hAnsiTheme="majorHAnsi"/>
+          <w:sz w:val="24"/>
+          <w:szCs w:val="24"/>
+          <w:lang w:val="en-GB"/>
+        </w:rPr>
+        <w:t>Scan/Checks all component in the given package name</w:t>
+      </w:r>
+      <w:r>
+        <w:rPr>
+          <w:rFonts w:asciiTheme="majorHAnsi" w:hAnsiTheme="majorHAnsi"/>
+          <w:sz w:val="24"/>
+          <w:szCs w:val="24"/>
+          <w:lang w:val="en-GB"/>
+        </w:rPr>
+        <w:t>.</w:t>
+      </w:r>
     </w:p>
     <w:p>
       <w:pPr>
@@ -131,15 +435,59 @@
           <w:numId w:val="3"/>
         </w:numPr>
         <w:rPr>
-          <w:lang w:val="en-GB"/>
-        </w:rPr>
-      </w:pPr>
-      <w:r>
-        <w:rPr>
+          <w:rFonts w:asciiTheme="majorHAnsi" w:hAnsiTheme="majorHAnsi"/>
+          <w:sz w:val="24"/>
+          <w:szCs w:val="24"/>
+          <w:lang w:val="en-GB"/>
+        </w:rPr>
+      </w:pPr>
+      <w:r>
+        <w:rPr>
+          <w:rFonts w:asciiTheme="majorHAnsi" w:hAnsiTheme="majorHAnsi"/>
+          <w:sz w:val="24"/>
+          <w:szCs w:val="24"/>
           <w:lang w:val="en-GB"/>
         </w:rPr>
         <w:t>@Configuration</w:t>
       </w:r>
+      <w:r>
+        <w:rPr>
+          <w:rFonts w:asciiTheme="majorHAnsi" w:hAnsiTheme="majorHAnsi"/>
+          <w:sz w:val="24"/>
+          <w:szCs w:val="24"/>
+          <w:lang w:val="en-GB"/>
+        </w:rPr>
+        <w:t xml:space="preserve">: </w:t>
+      </w:r>
+      <w:r>
+        <w:rPr>
+          <w:rFonts w:asciiTheme="majorHAnsi" w:hAnsiTheme="majorHAnsi"/>
+          <w:sz w:val="24"/>
+          <w:szCs w:val="24"/>
+          <w:lang w:val="en-GB"/>
+        </w:rPr>
+        <w:t xml:space="preserve">Indicates that a class has bean </w:t>
+      </w:r>
+      <w:proofErr w:type="spellStart"/>
+      <w:r>
+        <w:rPr>
+          <w:rFonts w:asciiTheme="majorHAnsi" w:hAnsiTheme="majorHAnsi"/>
+          <w:sz w:val="24"/>
+          <w:szCs w:val="24"/>
+          <w:lang w:val="en-GB"/>
+        </w:rPr>
+        <w:t>defination</w:t>
+      </w:r>
+      <w:proofErr w:type="spellEnd"/>
+      <w:r>
+        <w:rPr>
+          <w:rFonts w:asciiTheme="majorHAnsi" w:hAnsiTheme="majorHAnsi"/>
+          <w:sz w:val="24"/>
+          <w:szCs w:val="24"/>
+          <w:lang w:val="en-GB"/>
+        </w:rPr>
+        <w:t xml:space="preserve"> methods. Used In Conjunction with @Bean.</w:t>
+      </w:r>
     </w:p>
     <w:p>
       <w:pPr>
@@ -149,15 +497,39 @@
           <w:numId w:val="3"/>
         </w:numPr>
         <w:rPr>
-          <w:lang w:val="en-GB"/>
-        </w:rPr>
-      </w:pPr>
-      <w:r>
-        <w:rPr>
+          <w:rFonts w:asciiTheme="majorHAnsi" w:hAnsiTheme="majorHAnsi"/>
+          <w:sz w:val="24"/>
+          <w:szCs w:val="24"/>
+          <w:lang w:val="en-GB"/>
+        </w:rPr>
+      </w:pPr>
+      <w:r>
+        <w:rPr>
+          <w:rFonts w:asciiTheme="majorHAnsi" w:hAnsiTheme="majorHAnsi"/>
+          <w:sz w:val="24"/>
+          <w:szCs w:val="24"/>
           <w:lang w:val="en-GB"/>
         </w:rPr>
         <w:t>@Controller</w:t>
       </w:r>
+      <w:r>
+        <w:rPr>
+          <w:rFonts w:asciiTheme="majorHAnsi" w:hAnsiTheme="majorHAnsi"/>
+          <w:sz w:val="24"/>
+          <w:szCs w:val="24"/>
+          <w:lang w:val="en-GB"/>
+        </w:rPr>
+        <w:t xml:space="preserve">: </w:t>
+      </w:r>
+      <w:r>
+        <w:rPr>
+          <w:rFonts w:asciiTheme="majorHAnsi" w:hAnsiTheme="majorHAnsi"/>
+          <w:sz w:val="24"/>
+          <w:szCs w:val="24"/>
+          <w:lang w:val="en-GB"/>
+        </w:rPr>
+        <w:t>Indicates that the class is controller. It is used for traditional spring MVC framework Controller.</w:t>
+      </w:r>
     </w:p>
     <w:p>
       <w:pPr>
@@ -167,11 +539,17 @@
           <w:numId w:val="3"/>
         </w:numPr>
         <w:rPr>
-          <w:lang w:val="en-GB"/>
-        </w:rPr>
-      </w:pPr>
-      <w:r>
-        <w:rPr>
+          <w:rFonts w:asciiTheme="majorHAnsi" w:hAnsiTheme="majorHAnsi"/>
+          <w:sz w:val="24"/>
+          <w:szCs w:val="24"/>
+          <w:lang w:val="en-GB"/>
+        </w:rPr>
+      </w:pPr>
+      <w:r>
+        <w:rPr>
+          <w:rFonts w:asciiTheme="majorHAnsi" w:hAnsiTheme="majorHAnsi"/>
+          <w:sz w:val="24"/>
+          <w:szCs w:val="24"/>
           <w:lang w:val="en-GB"/>
         </w:rPr>
         <w:t>@</w:t>
@@ -179,11 +557,23 @@
       <w:proofErr w:type="spellStart"/>
       <w:r>
         <w:rPr>
+          <w:rFonts w:asciiTheme="majorHAnsi" w:hAnsiTheme="majorHAnsi"/>
+          <w:sz w:val="24"/>
+          <w:szCs w:val="24"/>
           <w:lang w:val="en-GB"/>
         </w:rPr>
         <w:t>DeleteMapping</w:t>
       </w:r>
       <w:proofErr w:type="spellEnd"/>
+      <w:r>
+        <w:rPr>
+          <w:rFonts w:asciiTheme="majorHAnsi" w:hAnsiTheme="majorHAnsi"/>
+          <w:sz w:val="24"/>
+          <w:szCs w:val="24"/>
+          <w:lang w:val="en-GB"/>
+        </w:rPr>
+        <w:t xml:space="preserve">: </w:t>
+      </w:r>
     </w:p>
     <w:p>
       <w:pPr>
@@ -193,11 +583,50 @@
           <w:numId w:val="3"/>
         </w:numPr>
         <w:rPr>
-          <w:lang w:val="en-GB"/>
-        </w:rPr>
-      </w:pPr>
-      <w:r>
-        <w:rPr>
+          <w:rFonts w:asciiTheme="majorHAnsi" w:hAnsiTheme="majorHAnsi"/>
+          <w:sz w:val="24"/>
+          <w:szCs w:val="24"/>
+          <w:lang w:val="en-GB"/>
+        </w:rPr>
+      </w:pPr>
+      <w:r>
+        <w:rPr>
+          <w:rFonts w:asciiTheme="majorHAnsi" w:hAnsiTheme="majorHAnsi"/>
+          <w:sz w:val="24"/>
+          <w:szCs w:val="24"/>
+          <w:lang w:val="en-GB"/>
+        </w:rPr>
+        <w:t xml:space="preserve">@Embeddable: </w:t>
+      </w:r>
+      <w:r>
+        <w:rPr>
+          <w:rFonts w:asciiTheme="majorHAnsi" w:hAnsiTheme="majorHAnsi"/>
+          <w:sz w:val="24"/>
+          <w:szCs w:val="24"/>
+          <w:lang w:val="en-GB"/>
+        </w:rPr>
+        <w:t>It is used to attach the one class into another class.</w:t>
+      </w:r>
+    </w:p>
+    <w:p>
+      <w:pPr>
+        <w:pStyle w:val="ListParagraph"/>
+        <w:numPr>
+          <w:ilvl w:val="0"/>
+          <w:numId w:val="3"/>
+        </w:numPr>
+        <w:rPr>
+          <w:rFonts w:asciiTheme="majorHAnsi" w:hAnsiTheme="majorHAnsi"/>
+          <w:sz w:val="24"/>
+          <w:szCs w:val="24"/>
+          <w:lang w:val="en-GB"/>
+        </w:rPr>
+      </w:pPr>
+      <w:r>
+        <w:rPr>
+          <w:rFonts w:asciiTheme="majorHAnsi" w:hAnsiTheme="majorHAnsi"/>
+          <w:sz w:val="24"/>
+          <w:szCs w:val="24"/>
           <w:lang w:val="en-GB"/>
         </w:rPr>
         <w:t>@</w:t>
@@ -205,6 +634,217 @@
       <w:proofErr w:type="spellStart"/>
       <w:r>
         <w:rPr>
+          <w:rFonts w:asciiTheme="majorHAnsi" w:hAnsiTheme="majorHAnsi"/>
+          <w:sz w:val="24"/>
+          <w:szCs w:val="24"/>
+          <w:lang w:val="en-GB"/>
+        </w:rPr>
+        <w:t>EnableAutoConfiguration</w:t>
+      </w:r>
+      <w:proofErr w:type="spellEnd"/>
+      <w:r>
+        <w:rPr>
+          <w:rFonts w:asciiTheme="majorHAnsi" w:hAnsiTheme="majorHAnsi"/>
+          <w:sz w:val="24"/>
+          <w:szCs w:val="24"/>
+          <w:lang w:val="en-GB"/>
+        </w:rPr>
+        <w:t xml:space="preserve">: </w:t>
+      </w:r>
+      <w:r>
+        <w:rPr>
+          <w:rFonts w:asciiTheme="majorHAnsi" w:hAnsiTheme="majorHAnsi"/>
+          <w:sz w:val="24"/>
+          <w:szCs w:val="24"/>
+          <w:lang w:val="en-GB"/>
+        </w:rPr>
+        <w:t xml:space="preserve">Automatically configures specific class or bean from </w:t>
+      </w:r>
+      <w:proofErr w:type="spellStart"/>
+      <w:r>
+        <w:rPr>
+          <w:rFonts w:asciiTheme="majorHAnsi" w:hAnsiTheme="majorHAnsi"/>
+          <w:sz w:val="24"/>
+          <w:szCs w:val="24"/>
+          <w:lang w:val="en-GB"/>
+        </w:rPr>
+        <w:t>classpath</w:t>
+      </w:r>
+      <w:proofErr w:type="spellEnd"/>
+      <w:r>
+        <w:rPr>
+          <w:rFonts w:asciiTheme="majorHAnsi" w:hAnsiTheme="majorHAnsi"/>
+          <w:sz w:val="24"/>
+          <w:szCs w:val="24"/>
+          <w:lang w:val="en-GB"/>
+        </w:rPr>
+        <w:t xml:space="preserve"> or any other way by which we want to configure.</w:t>
+      </w:r>
+    </w:p>
+    <w:p>
+      <w:pPr>
+        <w:pStyle w:val="ListParagraph"/>
+        <w:numPr>
+          <w:ilvl w:val="0"/>
+          <w:numId w:val="3"/>
+        </w:numPr>
+        <w:rPr>
+          <w:rFonts w:asciiTheme="majorHAnsi" w:hAnsiTheme="majorHAnsi"/>
+          <w:sz w:val="24"/>
+          <w:szCs w:val="24"/>
+          <w:lang w:val="en-GB"/>
+        </w:rPr>
+      </w:pPr>
+      <w:r>
+        <w:rPr>
+          <w:rFonts w:asciiTheme="majorHAnsi" w:hAnsiTheme="majorHAnsi"/>
+          <w:sz w:val="24"/>
+          <w:szCs w:val="24"/>
+          <w:lang w:val="en-GB"/>
+        </w:rPr>
+        <w:t>@</w:t>
+      </w:r>
+      <w:proofErr w:type="spellStart"/>
+      <w:r>
+        <w:rPr>
+          <w:rFonts w:asciiTheme="majorHAnsi" w:hAnsiTheme="majorHAnsi"/>
+          <w:sz w:val="24"/>
+          <w:szCs w:val="24"/>
+          <w:lang w:val="en-GB"/>
+        </w:rPr>
+        <w:t>EnableEurekaServer</w:t>
+      </w:r>
+      <w:proofErr w:type="spellEnd"/>
+      <w:r>
+        <w:rPr>
+          <w:rFonts w:asciiTheme="majorHAnsi" w:hAnsiTheme="majorHAnsi"/>
+          <w:sz w:val="24"/>
+          <w:szCs w:val="24"/>
+          <w:lang w:val="en-GB"/>
+        </w:rPr>
+        <w:t xml:space="preserve">: </w:t>
+      </w:r>
+      <w:r>
+        <w:rPr>
+          <w:rFonts w:asciiTheme="majorHAnsi" w:hAnsiTheme="majorHAnsi"/>
+          <w:sz w:val="24"/>
+          <w:szCs w:val="24"/>
+          <w:lang w:val="en-GB"/>
+        </w:rPr>
+        <w:t>In microservices</w:t>
+      </w:r>
+      <w:r>
+        <w:rPr>
+          <w:rFonts w:asciiTheme="majorHAnsi" w:hAnsiTheme="majorHAnsi"/>
+          <w:sz w:val="24"/>
+          <w:szCs w:val="24"/>
+          <w:lang w:val="en-GB"/>
+        </w:rPr>
+        <w:t>,</w:t>
+      </w:r>
+      <w:r>
+        <w:rPr>
+          <w:rFonts w:asciiTheme="majorHAnsi" w:hAnsiTheme="majorHAnsi"/>
+          <w:sz w:val="24"/>
+          <w:szCs w:val="24"/>
+          <w:lang w:val="en-GB"/>
+        </w:rPr>
+        <w:t xml:space="preserve"> it enables </w:t>
+      </w:r>
+      <w:proofErr w:type="gramStart"/>
+      <w:r>
+        <w:rPr>
+          <w:rFonts w:asciiTheme="majorHAnsi" w:hAnsiTheme="majorHAnsi"/>
+          <w:sz w:val="24"/>
+          <w:szCs w:val="24"/>
+          <w:lang w:val="en-GB"/>
+        </w:rPr>
+        <w:t>the eureka</w:t>
+      </w:r>
+      <w:proofErr w:type="gramEnd"/>
+      <w:r>
+        <w:rPr>
+          <w:rFonts w:asciiTheme="majorHAnsi" w:hAnsiTheme="majorHAnsi"/>
+          <w:sz w:val="24"/>
+          <w:szCs w:val="24"/>
+          <w:lang w:val="en-GB"/>
+        </w:rPr>
+        <w:t xml:space="preserve"> server.</w:t>
+      </w:r>
+    </w:p>
+    <w:p>
+      <w:pPr>
+        <w:pStyle w:val="ListParagraph"/>
+        <w:numPr>
+          <w:ilvl w:val="0"/>
+          <w:numId w:val="3"/>
+        </w:numPr>
+        <w:rPr>
+          <w:rFonts w:asciiTheme="majorHAnsi" w:hAnsiTheme="majorHAnsi"/>
+          <w:sz w:val="24"/>
+          <w:szCs w:val="24"/>
+          <w:lang w:val="en-GB"/>
+        </w:rPr>
+      </w:pPr>
+      <w:r>
+        <w:rPr>
+          <w:rFonts w:asciiTheme="majorHAnsi" w:hAnsiTheme="majorHAnsi"/>
+          <w:sz w:val="24"/>
+          <w:szCs w:val="24"/>
+          <w:lang w:val="en-GB"/>
+        </w:rPr>
+        <w:t>@</w:t>
+      </w:r>
+      <w:proofErr w:type="spellStart"/>
+      <w:r>
+        <w:rPr>
+          <w:rFonts w:asciiTheme="majorHAnsi" w:hAnsiTheme="majorHAnsi"/>
+          <w:sz w:val="24"/>
+          <w:szCs w:val="24"/>
+          <w:lang w:val="en-GB"/>
+        </w:rPr>
+        <w:t>EnableTransactionManagement</w:t>
+      </w:r>
+      <w:proofErr w:type="spellEnd"/>
+      <w:r>
+        <w:rPr>
+          <w:rFonts w:asciiTheme="majorHAnsi" w:hAnsiTheme="majorHAnsi"/>
+          <w:sz w:val="24"/>
+          <w:szCs w:val="24"/>
+          <w:lang w:val="en-GB"/>
+        </w:rPr>
+        <w:t xml:space="preserve">: </w:t>
+      </w:r>
+    </w:p>
+    <w:p>
+      <w:pPr>
+        <w:pStyle w:val="ListParagraph"/>
+        <w:numPr>
+          <w:ilvl w:val="0"/>
+          <w:numId w:val="3"/>
+        </w:numPr>
+        <w:rPr>
+          <w:rFonts w:asciiTheme="majorHAnsi" w:hAnsiTheme="majorHAnsi"/>
+          <w:sz w:val="24"/>
+          <w:szCs w:val="24"/>
+          <w:lang w:val="en-GB"/>
+        </w:rPr>
+      </w:pPr>
+      <w:r>
+        <w:rPr>
+          <w:rFonts w:asciiTheme="majorHAnsi" w:hAnsiTheme="majorHAnsi"/>
+          <w:sz w:val="24"/>
+          <w:szCs w:val="24"/>
+          <w:lang w:val="en-GB"/>
+        </w:rPr>
+        <w:t>@</w:t>
+      </w:r>
+      <w:proofErr w:type="spellStart"/>
+      <w:r>
+        <w:rPr>
+          <w:rFonts w:asciiTheme="majorHAnsi" w:hAnsiTheme="majorHAnsi"/>
+          <w:sz w:val="24"/>
+          <w:szCs w:val="24"/>
           <w:lang w:val="en-GB"/>
         </w:rPr>
         <w:t>GetMapping</w:t>
@@ -219,11 +859,41 @@
           <w:numId w:val="3"/>
         </w:numPr>
         <w:rPr>
-          <w:lang w:val="en-GB"/>
-        </w:rPr>
-      </w:pPr>
-      <w:r>
-        <w:rPr>
+          <w:rFonts w:asciiTheme="majorHAnsi" w:hAnsiTheme="majorHAnsi"/>
+          <w:sz w:val="24"/>
+          <w:szCs w:val="24"/>
+          <w:lang w:val="en-GB"/>
+        </w:rPr>
+      </w:pPr>
+      <w:r>
+        <w:rPr>
+          <w:rFonts w:asciiTheme="majorHAnsi" w:hAnsiTheme="majorHAnsi"/>
+          <w:sz w:val="24"/>
+          <w:szCs w:val="24"/>
+          <w:lang w:val="en-GB"/>
+        </w:rPr>
+        <w:t>@Import:</w:t>
+      </w:r>
+    </w:p>
+    <w:p>
+      <w:pPr>
+        <w:pStyle w:val="ListParagraph"/>
+        <w:numPr>
+          <w:ilvl w:val="0"/>
+          <w:numId w:val="3"/>
+        </w:numPr>
+        <w:rPr>
+          <w:rFonts w:asciiTheme="majorHAnsi" w:hAnsiTheme="majorHAnsi"/>
+          <w:sz w:val="24"/>
+          <w:szCs w:val="24"/>
+          <w:lang w:val="en-GB"/>
+        </w:rPr>
+      </w:pPr>
+      <w:r>
+        <w:rPr>
+          <w:rFonts w:asciiTheme="majorHAnsi" w:hAnsiTheme="majorHAnsi"/>
+          <w:sz w:val="24"/>
+          <w:szCs w:val="24"/>
           <w:lang w:val="en-GB"/>
         </w:rPr>
         <w:t>@</w:t>
@@ -231,11 +901,133 @@
       <w:proofErr w:type="spellStart"/>
       <w:r>
         <w:rPr>
+          <w:rFonts w:asciiTheme="majorHAnsi" w:hAnsiTheme="majorHAnsi"/>
+          <w:sz w:val="24"/>
+          <w:szCs w:val="24"/>
+          <w:lang w:val="en-GB"/>
+        </w:rPr>
+        <w:t>ModelAttribute</w:t>
+      </w:r>
+      <w:proofErr w:type="spellEnd"/>
+      <w:r>
+        <w:rPr>
+          <w:rFonts w:asciiTheme="majorHAnsi" w:hAnsiTheme="majorHAnsi"/>
+          <w:sz w:val="24"/>
+          <w:szCs w:val="24"/>
+          <w:lang w:val="en-GB"/>
+        </w:rPr>
+        <w:t xml:space="preserve">: </w:t>
+      </w:r>
+    </w:p>
+    <w:p>
+      <w:pPr>
+        <w:pStyle w:val="ListParagraph"/>
+        <w:numPr>
+          <w:ilvl w:val="0"/>
+          <w:numId w:val="3"/>
+        </w:numPr>
+        <w:rPr>
+          <w:rFonts w:asciiTheme="majorHAnsi" w:hAnsiTheme="majorHAnsi"/>
+          <w:sz w:val="24"/>
+          <w:szCs w:val="24"/>
+          <w:lang w:val="en-GB"/>
+        </w:rPr>
+      </w:pPr>
+      <w:r>
+        <w:rPr>
+          <w:rFonts w:asciiTheme="majorHAnsi" w:hAnsiTheme="majorHAnsi"/>
+          <w:sz w:val="24"/>
+          <w:szCs w:val="24"/>
+          <w:lang w:val="en-GB"/>
+        </w:rPr>
+        <w:t>@</w:t>
+      </w:r>
+      <w:proofErr w:type="spellStart"/>
+      <w:r>
+        <w:rPr>
+          <w:rFonts w:asciiTheme="majorHAnsi" w:hAnsiTheme="majorHAnsi"/>
+          <w:sz w:val="24"/>
+          <w:szCs w:val="24"/>
+          <w:lang w:val="en-GB"/>
+        </w:rPr>
+        <w:t>LoadBalanced</w:t>
+      </w:r>
+      <w:proofErr w:type="spellEnd"/>
+    </w:p>
+    <w:p>
+      <w:pPr>
+        <w:pStyle w:val="ListParagraph"/>
+        <w:numPr>
+          <w:ilvl w:val="0"/>
+          <w:numId w:val="3"/>
+        </w:numPr>
+        <w:rPr>
+          <w:rFonts w:asciiTheme="majorHAnsi" w:hAnsiTheme="majorHAnsi"/>
+          <w:sz w:val="24"/>
+          <w:szCs w:val="24"/>
+          <w:lang w:val="en-GB"/>
+        </w:rPr>
+      </w:pPr>
+      <w:proofErr w:type="gramStart"/>
+      <w:r>
+        <w:rPr>
+          <w:rFonts w:asciiTheme="majorHAnsi" w:hAnsiTheme="majorHAnsi"/>
+          <w:sz w:val="24"/>
+          <w:szCs w:val="24"/>
+          <w:lang w:val="en-GB"/>
+        </w:rPr>
+        <w:t>@</w:t>
+      </w:r>
+      <w:proofErr w:type="spellStart"/>
+      <w:r>
+        <w:rPr>
+          <w:rFonts w:asciiTheme="majorHAnsi" w:hAnsiTheme="majorHAnsi"/>
+          <w:sz w:val="24"/>
+          <w:szCs w:val="24"/>
+          <w:lang w:val="en-GB"/>
+        </w:rPr>
+        <w:t>Param</w:t>
+      </w:r>
+      <w:proofErr w:type="spellEnd"/>
+      <w:r>
+        <w:rPr>
+          <w:rFonts w:asciiTheme="majorHAnsi" w:hAnsiTheme="majorHAnsi"/>
+          <w:sz w:val="24"/>
+          <w:szCs w:val="24"/>
+          <w:lang w:val="en-GB"/>
+        </w:rPr>
+        <w:t>(</w:t>
+      </w:r>
+      <w:proofErr w:type="gramEnd"/>
+      <w:r>
+        <w:rPr>
+          <w:rFonts w:asciiTheme="majorHAnsi" w:hAnsiTheme="majorHAnsi"/>
+          <w:sz w:val="24"/>
+          <w:szCs w:val="24"/>
+          <w:lang w:val="en-GB"/>
+        </w:rPr>
+        <w:t>"any custom variable") java-variable :- used to bind java-variable with custom variable. By this value in java-variable will be passed on to custom variable. Used mainly with @</w:t>
+      </w:r>
+      <w:proofErr w:type="spellStart"/>
+      <w:r>
+        <w:rPr>
+          <w:rFonts w:asciiTheme="majorHAnsi" w:hAnsiTheme="majorHAnsi"/>
+          <w:sz w:val="24"/>
+          <w:szCs w:val="24"/>
           <w:lang w:val="en-GB"/>
         </w:rPr>
         <w:t>PathVariable</w:t>
       </w:r>
       <w:proofErr w:type="spellEnd"/>
+      <w:r>
+        <w:rPr>
+          <w:rFonts w:asciiTheme="majorHAnsi" w:hAnsiTheme="majorHAnsi"/>
+          <w:sz w:val="24"/>
+          <w:szCs w:val="24"/>
+          <w:lang w:val="en-GB"/>
+        </w:rPr>
+        <w:t>.</w:t>
+      </w:r>
     </w:p>
     <w:p>
       <w:pPr>
@@ -245,11 +1037,17 @@
           <w:numId w:val="3"/>
         </w:numPr>
         <w:rPr>
-          <w:lang w:val="en-GB"/>
-        </w:rPr>
-      </w:pPr>
-      <w:r>
-        <w:rPr>
+          <w:rFonts w:asciiTheme="majorHAnsi" w:hAnsiTheme="majorHAnsi"/>
+          <w:sz w:val="24"/>
+          <w:szCs w:val="24"/>
+          <w:lang w:val="en-GB"/>
+        </w:rPr>
+      </w:pPr>
+      <w:r>
+        <w:rPr>
+          <w:rFonts w:asciiTheme="majorHAnsi" w:hAnsiTheme="majorHAnsi"/>
+          <w:sz w:val="24"/>
+          <w:szCs w:val="24"/>
           <w:lang w:val="en-GB"/>
         </w:rPr>
         <w:t>@</w:t>
@@ -257,9 +1055,41 @@
       <w:proofErr w:type="spellStart"/>
       <w:r>
         <w:rPr>
-          <w:lang w:val="en-GB"/>
-        </w:rPr>
-        <w:t>PostDestroy</w:t>
+          <w:rFonts w:asciiTheme="majorHAnsi" w:hAnsiTheme="majorHAnsi"/>
+          <w:sz w:val="24"/>
+          <w:szCs w:val="24"/>
+          <w:lang w:val="en-GB"/>
+        </w:rPr>
+        <w:t>PathVariable</w:t>
+      </w:r>
+      <w:proofErr w:type="spellEnd"/>
+      <w:r>
+        <w:rPr>
+          <w:rFonts w:asciiTheme="majorHAnsi" w:hAnsiTheme="majorHAnsi"/>
+          <w:sz w:val="24"/>
+          <w:szCs w:val="24"/>
+          <w:lang w:val="en-GB"/>
+        </w:rPr>
+        <w:t xml:space="preserve">: </w:t>
+      </w:r>
+      <w:r>
+        <w:rPr>
+          <w:rFonts w:asciiTheme="majorHAnsi" w:hAnsiTheme="majorHAnsi"/>
+          <w:sz w:val="24"/>
+          <w:szCs w:val="24"/>
+          <w:lang w:val="en-GB"/>
+        </w:rPr>
+        <w:t xml:space="preserve">used when we want to pass dynamic variable in RequestMapping or </w:t>
+      </w:r>
+      <w:proofErr w:type="spellStart"/>
+      <w:r>
+        <w:rPr>
+          <w:rFonts w:asciiTheme="majorHAnsi" w:hAnsiTheme="majorHAnsi"/>
+          <w:sz w:val="24"/>
+          <w:szCs w:val="24"/>
+          <w:lang w:val="en-GB"/>
+        </w:rPr>
+        <w:t>GetMapping</w:t>
       </w:r>
       <w:proofErr w:type="spellEnd"/>
     </w:p>
@@ -271,11 +1101,17 @@
           <w:numId w:val="3"/>
         </w:numPr>
         <w:rPr>
-          <w:lang w:val="en-GB"/>
-        </w:rPr>
-      </w:pPr>
-      <w:r>
-        <w:rPr>
+          <w:rFonts w:asciiTheme="majorHAnsi" w:hAnsiTheme="majorHAnsi"/>
+          <w:sz w:val="24"/>
+          <w:szCs w:val="24"/>
+          <w:lang w:val="en-GB"/>
+        </w:rPr>
+      </w:pPr>
+      <w:r>
+        <w:rPr>
+          <w:rFonts w:asciiTheme="majorHAnsi" w:hAnsiTheme="majorHAnsi"/>
+          <w:sz w:val="24"/>
+          <w:szCs w:val="24"/>
           <w:lang w:val="en-GB"/>
         </w:rPr>
         <w:t>@</w:t>
@@ -283,11 +1119,163 @@
       <w:proofErr w:type="spellStart"/>
       <w:r>
         <w:rPr>
+          <w:rFonts w:asciiTheme="majorHAnsi" w:hAnsiTheme="majorHAnsi"/>
+          <w:sz w:val="24"/>
+          <w:szCs w:val="24"/>
+          <w:lang w:val="en-GB"/>
+        </w:rPr>
+        <w:t>Post</w:t>
+      </w:r>
+      <w:r>
+        <w:rPr>
+          <w:rFonts w:asciiTheme="majorHAnsi" w:hAnsiTheme="majorHAnsi"/>
+          <w:sz w:val="24"/>
+          <w:szCs w:val="24"/>
+          <w:lang w:val="en-GB"/>
+        </w:rPr>
+        <w:t>Construct</w:t>
+      </w:r>
+      <w:proofErr w:type="spellEnd"/>
+      <w:r>
+        <w:rPr>
+          <w:rFonts w:asciiTheme="majorHAnsi" w:hAnsiTheme="majorHAnsi"/>
+          <w:sz w:val="24"/>
+          <w:szCs w:val="24"/>
+          <w:lang w:val="en-GB"/>
+        </w:rPr>
+        <w:t xml:space="preserve">: </w:t>
+      </w:r>
+      <w:r>
+        <w:rPr>
+          <w:rFonts w:asciiTheme="majorHAnsi" w:hAnsiTheme="majorHAnsi"/>
+          <w:sz w:val="24"/>
+          <w:szCs w:val="24"/>
+          <w:lang w:val="en-GB"/>
+        </w:rPr>
+        <w:t>It is part of Bean Life cycle. Spring calls methods annotated with @</w:t>
+      </w:r>
+      <w:proofErr w:type="spellStart"/>
+      <w:r>
+        <w:rPr>
+          <w:rFonts w:asciiTheme="majorHAnsi" w:hAnsiTheme="majorHAnsi"/>
+          <w:sz w:val="24"/>
+          <w:szCs w:val="24"/>
+          <w:lang w:val="en-GB"/>
+        </w:rPr>
+        <w:t>PostConstruct</w:t>
+      </w:r>
+      <w:proofErr w:type="spellEnd"/>
+      <w:r>
+        <w:rPr>
+          <w:rFonts w:asciiTheme="majorHAnsi" w:hAnsiTheme="majorHAnsi"/>
+          <w:sz w:val="24"/>
+          <w:szCs w:val="24"/>
+          <w:lang w:val="en-GB"/>
+        </w:rPr>
+        <w:t xml:space="preserve"> only once, just after the initialization of bean properties.</w:t>
+      </w:r>
+      <w:r>
+        <w:rPr>
+          <w:rFonts w:asciiTheme="majorHAnsi" w:hAnsiTheme="majorHAnsi"/>
+          <w:sz w:val="24"/>
+          <w:szCs w:val="24"/>
+          <w:lang w:val="en-GB"/>
+        </w:rPr>
+        <w:t xml:space="preserve"> </w:t>
+      </w:r>
+      <w:r>
+        <w:rPr>
+          <w:rFonts w:asciiTheme="majorHAnsi" w:hAnsiTheme="majorHAnsi"/>
+          <w:sz w:val="24"/>
+          <w:szCs w:val="24"/>
+          <w:lang w:val="en-GB"/>
+        </w:rPr>
+        <w:t>For Example</w:t>
+      </w:r>
+      <w:proofErr w:type="gramStart"/>
+      <w:r>
+        <w:rPr>
+          <w:rFonts w:asciiTheme="majorHAnsi" w:hAnsiTheme="majorHAnsi"/>
+          <w:sz w:val="24"/>
+          <w:szCs w:val="24"/>
+          <w:lang w:val="en-GB"/>
+        </w:rPr>
+        <w:t>:-</w:t>
+      </w:r>
+      <w:proofErr w:type="gramEnd"/>
+      <w:r>
+        <w:rPr>
+          <w:rFonts w:asciiTheme="majorHAnsi" w:hAnsiTheme="majorHAnsi"/>
+          <w:sz w:val="24"/>
+          <w:szCs w:val="24"/>
+          <w:lang w:val="en-GB"/>
+        </w:rPr>
+        <w:t xml:space="preserve"> We can use @</w:t>
+      </w:r>
+      <w:proofErr w:type="spellStart"/>
+      <w:r>
+        <w:rPr>
+          <w:rFonts w:asciiTheme="majorHAnsi" w:hAnsiTheme="majorHAnsi"/>
+          <w:sz w:val="24"/>
+          <w:szCs w:val="24"/>
+          <w:lang w:val="en-GB"/>
+        </w:rPr>
+        <w:t>PostConstruct</w:t>
+      </w:r>
+      <w:proofErr w:type="spellEnd"/>
+      <w:r>
+        <w:rPr>
+          <w:rFonts w:asciiTheme="majorHAnsi" w:hAnsiTheme="majorHAnsi"/>
+          <w:sz w:val="24"/>
+          <w:szCs w:val="24"/>
+          <w:lang w:val="en-GB"/>
+        </w:rPr>
+        <w:t xml:space="preserve"> while we are creating a database connection (as we don't want to create connection again and again.)</w:t>
+      </w:r>
+    </w:p>
+    <w:p>
+      <w:pPr>
+        <w:pStyle w:val="ListParagraph"/>
+        <w:numPr>
+          <w:ilvl w:val="0"/>
+          <w:numId w:val="3"/>
+        </w:numPr>
+        <w:rPr>
+          <w:rFonts w:asciiTheme="majorHAnsi" w:hAnsiTheme="majorHAnsi"/>
+          <w:sz w:val="24"/>
+          <w:szCs w:val="24"/>
+          <w:lang w:val="en-GB"/>
+        </w:rPr>
+      </w:pPr>
+      <w:r>
+        <w:rPr>
+          <w:rFonts w:asciiTheme="majorHAnsi" w:hAnsiTheme="majorHAnsi"/>
+          <w:sz w:val="24"/>
+          <w:szCs w:val="24"/>
+          <w:lang w:val="en-GB"/>
+        </w:rPr>
+        <w:t>@</w:t>
+      </w:r>
+      <w:proofErr w:type="spellStart"/>
+      <w:r>
+        <w:rPr>
+          <w:rFonts w:asciiTheme="majorHAnsi" w:hAnsiTheme="majorHAnsi"/>
+          <w:sz w:val="24"/>
+          <w:szCs w:val="24"/>
           <w:lang w:val="en-GB"/>
         </w:rPr>
         <w:t>PostMapping</w:t>
       </w:r>
       <w:proofErr w:type="spellEnd"/>
+      <w:r>
+        <w:rPr>
+          <w:rFonts w:asciiTheme="majorHAnsi" w:hAnsiTheme="majorHAnsi"/>
+          <w:sz w:val="24"/>
+          <w:szCs w:val="24"/>
+          <w:lang w:val="en-GB"/>
+        </w:rPr>
+        <w:t xml:space="preserve">: </w:t>
+      </w:r>
     </w:p>
     <w:p>
       <w:pPr>
@@ -297,23 +1285,176 @@
           <w:numId w:val="3"/>
         </w:numPr>
         <w:rPr>
-          <w:lang w:val="en-GB"/>
-        </w:rPr>
-      </w:pPr>
-      <w:r>
-        <w:rPr>
-          <w:lang w:val="en-GB"/>
-        </w:rPr>
+          <w:rFonts w:asciiTheme="majorHAnsi" w:hAnsiTheme="majorHAnsi"/>
+          <w:sz w:val="24"/>
+          <w:szCs w:val="24"/>
+          <w:lang w:val="en-GB"/>
+        </w:rPr>
+      </w:pPr>
+      <w:r>
+        <w:rPr>
+          <w:rFonts w:asciiTheme="majorHAnsi" w:hAnsiTheme="majorHAnsi"/>
+          <w:sz w:val="24"/>
+          <w:szCs w:val="24"/>
+          <w:lang w:val="en-GB"/>
+        </w:rPr>
+        <w:lastRenderedPageBreak/>
         <w:t>@</w:t>
       </w:r>
       <w:proofErr w:type="spellStart"/>
       <w:r>
         <w:rPr>
-          <w:lang w:val="en-GB"/>
-        </w:rPr>
-        <w:t>PreConstruct</w:t>
-      </w:r>
-      <w:proofErr w:type="spellEnd"/>
+          <w:rFonts w:asciiTheme="majorHAnsi" w:hAnsiTheme="majorHAnsi"/>
+          <w:sz w:val="24"/>
+          <w:szCs w:val="24"/>
+          <w:lang w:val="en-GB"/>
+        </w:rPr>
+        <w:t>Pre</w:t>
+      </w:r>
+      <w:r>
+        <w:rPr>
+          <w:rFonts w:asciiTheme="majorHAnsi" w:hAnsiTheme="majorHAnsi"/>
+          <w:sz w:val="24"/>
+          <w:szCs w:val="24"/>
+          <w:lang w:val="en-GB"/>
+        </w:rPr>
+        <w:t>Destroy</w:t>
+      </w:r>
+      <w:proofErr w:type="spellEnd"/>
+      <w:r>
+        <w:rPr>
+          <w:rFonts w:asciiTheme="majorHAnsi" w:hAnsiTheme="majorHAnsi"/>
+          <w:sz w:val="24"/>
+          <w:szCs w:val="24"/>
+          <w:lang w:val="en-GB"/>
+        </w:rPr>
+        <w:t xml:space="preserve">: </w:t>
+      </w:r>
+      <w:r>
+        <w:rPr>
+          <w:rFonts w:asciiTheme="majorHAnsi" w:hAnsiTheme="majorHAnsi"/>
+          <w:sz w:val="24"/>
+          <w:szCs w:val="24"/>
+          <w:lang w:val="en-GB"/>
+        </w:rPr>
+        <w:t>It is part of Bean Life cycle.</w:t>
+      </w:r>
+      <w:r>
+        <w:rPr>
+          <w:rFonts w:asciiTheme="majorHAnsi" w:hAnsiTheme="majorHAnsi"/>
+          <w:sz w:val="24"/>
+          <w:szCs w:val="24"/>
+          <w:lang w:val="en-GB"/>
+        </w:rPr>
+        <w:t xml:space="preserve"> </w:t>
+      </w:r>
+      <w:r>
+        <w:rPr>
+          <w:rFonts w:asciiTheme="majorHAnsi" w:hAnsiTheme="majorHAnsi"/>
+          <w:sz w:val="24"/>
+          <w:szCs w:val="24"/>
+          <w:lang w:val="en-GB"/>
+        </w:rPr>
+        <w:t>Spring calls method annotated with @</w:t>
+      </w:r>
+      <w:proofErr w:type="spellStart"/>
+      <w:r>
+        <w:rPr>
+          <w:rFonts w:asciiTheme="majorHAnsi" w:hAnsiTheme="majorHAnsi"/>
+          <w:sz w:val="24"/>
+          <w:szCs w:val="24"/>
+          <w:lang w:val="en-GB"/>
+        </w:rPr>
+        <w:t>PreDestroy</w:t>
+      </w:r>
+      <w:proofErr w:type="spellEnd"/>
+      <w:r>
+        <w:rPr>
+          <w:rFonts w:asciiTheme="majorHAnsi" w:hAnsiTheme="majorHAnsi"/>
+          <w:sz w:val="24"/>
+          <w:szCs w:val="24"/>
+          <w:lang w:val="en-GB"/>
+        </w:rPr>
+        <w:t xml:space="preserve"> runs only once, just before </w:t>
+      </w:r>
+      <w:proofErr w:type="gramStart"/>
+      <w:r>
+        <w:rPr>
+          <w:rFonts w:asciiTheme="majorHAnsi" w:hAnsiTheme="majorHAnsi"/>
+          <w:sz w:val="24"/>
+          <w:szCs w:val="24"/>
+          <w:lang w:val="en-GB"/>
+        </w:rPr>
+        <w:t>Spring</w:t>
+      </w:r>
+      <w:proofErr w:type="gramEnd"/>
+      <w:r>
+        <w:rPr>
+          <w:rFonts w:asciiTheme="majorHAnsi" w:hAnsiTheme="majorHAnsi"/>
+          <w:sz w:val="24"/>
+          <w:szCs w:val="24"/>
+          <w:lang w:val="en-GB"/>
+        </w:rPr>
+        <w:t xml:space="preserve"> removes our bean from the application context</w:t>
+      </w:r>
+      <w:r>
+        <w:rPr>
+          <w:rFonts w:asciiTheme="majorHAnsi" w:hAnsiTheme="majorHAnsi"/>
+          <w:sz w:val="24"/>
+          <w:szCs w:val="24"/>
+          <w:lang w:val="en-GB"/>
+        </w:rPr>
+        <w:t xml:space="preserve">. </w:t>
+      </w:r>
+      <w:r>
+        <w:rPr>
+          <w:rFonts w:asciiTheme="majorHAnsi" w:hAnsiTheme="majorHAnsi"/>
+          <w:sz w:val="24"/>
+          <w:szCs w:val="24"/>
+          <w:lang w:val="en-GB"/>
+        </w:rPr>
+        <w:t>For Example</w:t>
+      </w:r>
+      <w:proofErr w:type="gramStart"/>
+      <w:r>
+        <w:rPr>
+          <w:rFonts w:asciiTheme="majorHAnsi" w:hAnsiTheme="majorHAnsi"/>
+          <w:sz w:val="24"/>
+          <w:szCs w:val="24"/>
+          <w:lang w:val="en-GB"/>
+        </w:rPr>
+        <w:t>:-</w:t>
+      </w:r>
+      <w:proofErr w:type="gramEnd"/>
+      <w:r>
+        <w:rPr>
+          <w:rFonts w:asciiTheme="majorHAnsi" w:hAnsiTheme="majorHAnsi"/>
+          <w:sz w:val="24"/>
+          <w:szCs w:val="24"/>
+          <w:lang w:val="en-GB"/>
+        </w:rPr>
+        <w:t xml:space="preserve"> We can use @</w:t>
+      </w:r>
+      <w:proofErr w:type="spellStart"/>
+      <w:r>
+        <w:rPr>
+          <w:rFonts w:asciiTheme="majorHAnsi" w:hAnsiTheme="majorHAnsi"/>
+          <w:sz w:val="24"/>
+          <w:szCs w:val="24"/>
+          <w:lang w:val="en-GB"/>
+        </w:rPr>
+        <w:t>PreDestroy</w:t>
+      </w:r>
+      <w:proofErr w:type="spellEnd"/>
+      <w:r>
+        <w:rPr>
+          <w:rFonts w:asciiTheme="majorHAnsi" w:hAnsiTheme="majorHAnsi"/>
+          <w:sz w:val="24"/>
+          <w:szCs w:val="24"/>
+          <w:lang w:val="en-GB"/>
+        </w:rPr>
+        <w:t xml:space="preserve"> for closing database connection.</w:t>
+      </w:r>
     </w:p>
     <w:p>
       <w:pPr>
@@ -323,11 +1464,18 @@
           <w:numId w:val="3"/>
         </w:numPr>
         <w:rPr>
-          <w:lang w:val="en-GB"/>
-        </w:rPr>
-      </w:pPr>
-      <w:r>
-        <w:rPr>
+          <w:rFonts w:asciiTheme="majorHAnsi" w:hAnsiTheme="majorHAnsi"/>
+          <w:sz w:val="24"/>
+          <w:szCs w:val="24"/>
+          <w:lang w:val="en-GB"/>
+        </w:rPr>
+      </w:pPr>
+      <w:proofErr w:type="gramStart"/>
+      <w:r>
+        <w:rPr>
+          <w:rFonts w:asciiTheme="majorHAnsi" w:hAnsiTheme="majorHAnsi"/>
+          <w:sz w:val="24"/>
+          <w:szCs w:val="24"/>
           <w:lang w:val="en-GB"/>
         </w:rPr>
         <w:t>@</w:t>
@@ -335,17 +1483,106 @@
       <w:proofErr w:type="spellStart"/>
       <w:r>
         <w:rPr>
+          <w:rFonts w:asciiTheme="majorHAnsi" w:hAnsiTheme="majorHAnsi"/>
+          <w:sz w:val="24"/>
+          <w:szCs w:val="24"/>
+          <w:lang w:val="en-GB"/>
+        </w:rPr>
+        <w:t>PropertySource</w:t>
+      </w:r>
+      <w:proofErr w:type="spellEnd"/>
+      <w:r>
+        <w:rPr>
+          <w:rFonts w:asciiTheme="majorHAnsi" w:hAnsiTheme="majorHAnsi"/>
+          <w:sz w:val="24"/>
+          <w:szCs w:val="24"/>
+          <w:lang w:val="en-GB"/>
+        </w:rPr>
+        <w:t>(</w:t>
+      </w:r>
+      <w:proofErr w:type="gramEnd"/>
+      <w:r>
+        <w:rPr>
+          <w:rFonts w:asciiTheme="majorHAnsi" w:hAnsiTheme="majorHAnsi"/>
+          <w:sz w:val="24"/>
+          <w:szCs w:val="24"/>
+          <w:lang w:val="en-GB"/>
+        </w:rPr>
+        <w:t>"</w:t>
+      </w:r>
+      <w:proofErr w:type="spellStart"/>
+      <w:r>
+        <w:rPr>
+          <w:rFonts w:asciiTheme="majorHAnsi" w:hAnsiTheme="majorHAnsi"/>
+          <w:sz w:val="24"/>
+          <w:szCs w:val="24"/>
+          <w:lang w:val="en-GB"/>
+        </w:rPr>
+        <w:t>classpath:propertyFileName</w:t>
+      </w:r>
+      <w:proofErr w:type="spellEnd"/>
+      <w:r>
+        <w:rPr>
+          <w:rFonts w:asciiTheme="majorHAnsi" w:hAnsiTheme="majorHAnsi"/>
+          <w:sz w:val="24"/>
+          <w:szCs w:val="24"/>
+          <w:lang w:val="en-GB"/>
+        </w:rPr>
+        <w:t>") :- used to fetch data from property file.</w:t>
+      </w:r>
+    </w:p>
+    <w:p>
+      <w:pPr>
+        <w:pStyle w:val="ListParagraph"/>
+        <w:numPr>
+          <w:ilvl w:val="0"/>
+          <w:numId w:val="3"/>
+        </w:numPr>
+        <w:rPr>
+          <w:rFonts w:asciiTheme="majorHAnsi" w:hAnsiTheme="majorHAnsi"/>
+          <w:sz w:val="24"/>
+          <w:szCs w:val="24"/>
+          <w:lang w:val="en-GB"/>
+        </w:rPr>
+      </w:pPr>
+      <w:r>
+        <w:rPr>
+          <w:rFonts w:asciiTheme="majorHAnsi" w:hAnsiTheme="majorHAnsi"/>
+          <w:sz w:val="24"/>
+          <w:szCs w:val="24"/>
+          <w:lang w:val="en-GB"/>
+        </w:rPr>
+        <w:t>@</w:t>
+      </w:r>
+      <w:proofErr w:type="spellStart"/>
+      <w:r>
+        <w:rPr>
+          <w:rFonts w:asciiTheme="majorHAnsi" w:hAnsiTheme="majorHAnsi"/>
+          <w:sz w:val="24"/>
+          <w:szCs w:val="24"/>
           <w:lang w:val="en-GB"/>
         </w:rPr>
         <w:t>Put</w:t>
       </w:r>
       <w:r>
         <w:rPr>
+          <w:rFonts w:asciiTheme="majorHAnsi" w:hAnsiTheme="majorHAnsi"/>
+          <w:sz w:val="24"/>
+          <w:szCs w:val="24"/>
           <w:lang w:val="en-GB"/>
         </w:rPr>
         <w:t>Mapping</w:t>
       </w:r>
       <w:proofErr w:type="spellEnd"/>
+      <w:r>
+        <w:rPr>
+          <w:rFonts w:asciiTheme="majorHAnsi" w:hAnsiTheme="majorHAnsi"/>
+          <w:sz w:val="24"/>
+          <w:szCs w:val="24"/>
+          <w:lang w:val="en-GB"/>
+        </w:rPr>
+        <w:t xml:space="preserve">: </w:t>
+      </w:r>
     </w:p>
     <w:p>
       <w:pPr>
@@ -355,14 +1592,69 @@
           <w:numId w:val="3"/>
         </w:numPr>
         <w:rPr>
-          <w:lang w:val="en-GB"/>
-        </w:rPr>
-      </w:pPr>
-      <w:r>
-        <w:rPr>
-          <w:lang w:val="en-GB"/>
-        </w:rPr>
-        <w:t>@Qualifier(Bean-Name)</w:t>
+          <w:rFonts w:asciiTheme="majorHAnsi" w:hAnsiTheme="majorHAnsi"/>
+          <w:sz w:val="24"/>
+          <w:szCs w:val="24"/>
+          <w:lang w:val="en-GB"/>
+        </w:rPr>
+      </w:pPr>
+      <w:proofErr w:type="gramStart"/>
+      <w:r>
+        <w:rPr>
+          <w:rFonts w:asciiTheme="majorHAnsi" w:hAnsiTheme="majorHAnsi"/>
+          <w:sz w:val="24"/>
+          <w:szCs w:val="24"/>
+          <w:lang w:val="en-GB"/>
+        </w:rPr>
+        <w:t>@Qualifier(</w:t>
+      </w:r>
+      <w:proofErr w:type="gramEnd"/>
+      <w:r>
+        <w:rPr>
+          <w:rFonts w:asciiTheme="majorHAnsi" w:hAnsiTheme="majorHAnsi"/>
+          <w:sz w:val="24"/>
+          <w:szCs w:val="24"/>
+          <w:lang w:val="en-GB"/>
+        </w:rPr>
+        <w:t>Bean-Name)</w:t>
+      </w:r>
+      <w:r>
+        <w:rPr>
+          <w:rFonts w:asciiTheme="majorHAnsi" w:hAnsiTheme="majorHAnsi"/>
+          <w:sz w:val="24"/>
+          <w:szCs w:val="24"/>
+          <w:lang w:val="en-GB"/>
+        </w:rPr>
+        <w:t xml:space="preserve">: </w:t>
+      </w:r>
+      <w:r>
+        <w:rPr>
+          <w:rFonts w:asciiTheme="majorHAnsi" w:hAnsiTheme="majorHAnsi"/>
+          <w:sz w:val="24"/>
+          <w:szCs w:val="24"/>
+          <w:lang w:val="en-GB"/>
+        </w:rPr>
+        <w:t>There may be a situation when you create more than one bean of the same type and want to wire only one of them with a property. In such cases, you can use the @Qualifier annotation along with @</w:t>
+      </w:r>
+      <w:proofErr w:type="spellStart"/>
+      <w:r>
+        <w:rPr>
+          <w:rFonts w:asciiTheme="majorHAnsi" w:hAnsiTheme="majorHAnsi"/>
+          <w:sz w:val="24"/>
+          <w:szCs w:val="24"/>
+          <w:lang w:val="en-GB"/>
+        </w:rPr>
+        <w:t>Autowired</w:t>
+      </w:r>
+      <w:proofErr w:type="spellEnd"/>
+      <w:r>
+        <w:rPr>
+          <w:rFonts w:asciiTheme="majorHAnsi" w:hAnsiTheme="majorHAnsi"/>
+          <w:sz w:val="24"/>
+          <w:szCs w:val="24"/>
+          <w:lang w:val="en-GB"/>
+        </w:rPr>
+        <w:t xml:space="preserve"> to remove the confusion by specifying which exact bean will be wired.</w:t>
       </w:r>
     </w:p>
     <w:p>
@@ -373,15 +1665,39 @@
           <w:numId w:val="3"/>
         </w:numPr>
         <w:rPr>
-          <w:lang w:val="en-GB"/>
-        </w:rPr>
-      </w:pPr>
-      <w:r>
-        <w:rPr>
+          <w:rFonts w:asciiTheme="majorHAnsi" w:hAnsiTheme="majorHAnsi"/>
+          <w:sz w:val="24"/>
+          <w:szCs w:val="24"/>
+          <w:lang w:val="en-GB"/>
+        </w:rPr>
+      </w:pPr>
+      <w:r>
+        <w:rPr>
+          <w:rFonts w:asciiTheme="majorHAnsi" w:hAnsiTheme="majorHAnsi"/>
+          <w:sz w:val="24"/>
+          <w:szCs w:val="24"/>
           <w:lang w:val="en-GB"/>
         </w:rPr>
         <w:t>@Repository</w:t>
       </w:r>
+      <w:r>
+        <w:rPr>
+          <w:rFonts w:asciiTheme="majorHAnsi" w:hAnsiTheme="majorHAnsi"/>
+          <w:sz w:val="24"/>
+          <w:szCs w:val="24"/>
+          <w:lang w:val="en-GB"/>
+        </w:rPr>
+        <w:t xml:space="preserve">: </w:t>
+      </w:r>
+      <w:r>
+        <w:rPr>
+          <w:rFonts w:asciiTheme="majorHAnsi" w:hAnsiTheme="majorHAnsi"/>
+          <w:sz w:val="24"/>
+          <w:szCs w:val="24"/>
+          <w:lang w:val="en-GB"/>
+        </w:rPr>
+        <w:t>Indicates that a class is a repository.</w:t>
+      </w:r>
     </w:p>
     <w:p>
       <w:pPr>
@@ -391,11 +1707,17 @@
           <w:numId w:val="3"/>
         </w:numPr>
         <w:rPr>
-          <w:lang w:val="en-GB"/>
-        </w:rPr>
-      </w:pPr>
-      <w:r>
-        <w:rPr>
+          <w:rFonts w:asciiTheme="majorHAnsi" w:hAnsiTheme="majorHAnsi"/>
+          <w:sz w:val="24"/>
+          <w:szCs w:val="24"/>
+          <w:lang w:val="en-GB"/>
+        </w:rPr>
+      </w:pPr>
+      <w:r>
+        <w:rPr>
+          <w:rFonts w:asciiTheme="majorHAnsi" w:hAnsiTheme="majorHAnsi"/>
+          <w:sz w:val="24"/>
+          <w:szCs w:val="24"/>
           <w:lang w:val="en-GB"/>
         </w:rPr>
         <w:t>@</w:t>
@@ -403,11 +1725,123 @@
       <w:proofErr w:type="spellStart"/>
       <w:r>
         <w:rPr>
+          <w:rFonts w:asciiTheme="majorHAnsi" w:hAnsiTheme="majorHAnsi"/>
+          <w:sz w:val="24"/>
+          <w:szCs w:val="24"/>
+          <w:lang w:val="en-GB"/>
+        </w:rPr>
+        <w:t>RestController</w:t>
+      </w:r>
+      <w:proofErr w:type="spellEnd"/>
+      <w:r>
+        <w:rPr>
+          <w:rFonts w:asciiTheme="majorHAnsi" w:hAnsiTheme="majorHAnsi"/>
+          <w:sz w:val="24"/>
+          <w:szCs w:val="24"/>
+          <w:lang w:val="en-GB"/>
+        </w:rPr>
+        <w:t xml:space="preserve">: </w:t>
+      </w:r>
+      <w:r>
+        <w:rPr>
+          <w:rFonts w:asciiTheme="majorHAnsi" w:hAnsiTheme="majorHAnsi"/>
+          <w:sz w:val="24"/>
+          <w:szCs w:val="24"/>
+          <w:lang w:val="en-GB"/>
+        </w:rPr>
+        <w:t>Indicates that the class is controller, which is used to handle restful services.</w:t>
+      </w:r>
+      <w:r>
+        <w:rPr>
+          <w:rFonts w:asciiTheme="majorHAnsi" w:hAnsiTheme="majorHAnsi"/>
+          <w:sz w:val="24"/>
+          <w:szCs w:val="24"/>
+          <w:lang w:val="en-GB"/>
+        </w:rPr>
+        <w:t xml:space="preserve"> </w:t>
+      </w:r>
+      <w:r>
+        <w:rPr>
+          <w:rFonts w:asciiTheme="majorHAnsi" w:hAnsiTheme="majorHAnsi"/>
+          <w:sz w:val="24"/>
+          <w:szCs w:val="24"/>
+          <w:lang w:val="en-GB"/>
+        </w:rPr>
+        <w:t>Equivalent to @Controller+@</w:t>
+      </w:r>
+      <w:proofErr w:type="spellStart"/>
+      <w:r>
+        <w:rPr>
+          <w:rFonts w:asciiTheme="majorHAnsi" w:hAnsiTheme="majorHAnsi"/>
+          <w:sz w:val="24"/>
+          <w:szCs w:val="24"/>
+          <w:lang w:val="en-GB"/>
+        </w:rPr>
+        <w:t>ResponseBody</w:t>
+      </w:r>
+      <w:proofErr w:type="spellEnd"/>
+      <w:r>
+        <w:rPr>
+          <w:rFonts w:asciiTheme="majorHAnsi" w:hAnsiTheme="majorHAnsi"/>
+          <w:sz w:val="24"/>
+          <w:szCs w:val="24"/>
+          <w:lang w:val="en-GB"/>
+        </w:rPr>
+        <w:t>.</w:t>
+      </w:r>
+    </w:p>
+    <w:p>
+      <w:pPr>
+        <w:pStyle w:val="ListParagraph"/>
+        <w:numPr>
+          <w:ilvl w:val="0"/>
+          <w:numId w:val="3"/>
+        </w:numPr>
+        <w:rPr>
+          <w:rFonts w:asciiTheme="majorHAnsi" w:hAnsiTheme="majorHAnsi"/>
+          <w:sz w:val="24"/>
+          <w:szCs w:val="24"/>
+          <w:lang w:val="en-GB"/>
+        </w:rPr>
+      </w:pPr>
+      <w:r>
+        <w:rPr>
+          <w:rFonts w:asciiTheme="majorHAnsi" w:hAnsiTheme="majorHAnsi"/>
+          <w:sz w:val="24"/>
+          <w:szCs w:val="24"/>
+          <w:lang w:val="en-GB"/>
+        </w:rPr>
+        <w:t>@</w:t>
+      </w:r>
+      <w:proofErr w:type="spellStart"/>
+      <w:r>
+        <w:rPr>
+          <w:rFonts w:asciiTheme="majorHAnsi" w:hAnsiTheme="majorHAnsi"/>
+          <w:sz w:val="24"/>
+          <w:szCs w:val="24"/>
           <w:lang w:val="en-GB"/>
         </w:rPr>
         <w:t>RequestBody</w:t>
       </w:r>
       <w:proofErr w:type="spellEnd"/>
+      <w:r>
+        <w:rPr>
+          <w:rFonts w:asciiTheme="majorHAnsi" w:hAnsiTheme="majorHAnsi"/>
+          <w:sz w:val="24"/>
+          <w:szCs w:val="24"/>
+          <w:lang w:val="en-GB"/>
+        </w:rPr>
+        <w:t xml:space="preserve">: </w:t>
+      </w:r>
+      <w:r>
+        <w:rPr>
+          <w:rFonts w:asciiTheme="majorHAnsi" w:hAnsiTheme="majorHAnsi"/>
+          <w:sz w:val="24"/>
+          <w:szCs w:val="24"/>
+          <w:lang w:val="en-GB"/>
+        </w:rPr>
+        <w:t>used for extracting data from body of object send from frontend.</w:t>
+      </w:r>
     </w:p>
     <w:p>
       <w:pPr>
@@ -417,11 +1851,177 @@
           <w:numId w:val="3"/>
         </w:numPr>
         <w:rPr>
-          <w:lang w:val="en-GB"/>
-        </w:rPr>
-      </w:pPr>
-      <w:r>
-        <w:rPr>
+          <w:rFonts w:asciiTheme="majorHAnsi" w:hAnsiTheme="majorHAnsi"/>
+          <w:sz w:val="24"/>
+          <w:szCs w:val="24"/>
+          <w:lang w:val="en-GB"/>
+        </w:rPr>
+      </w:pPr>
+      <w:proofErr w:type="gramStart"/>
+      <w:r>
+        <w:rPr>
+          <w:rFonts w:asciiTheme="majorHAnsi" w:hAnsiTheme="majorHAnsi"/>
+          <w:sz w:val="24"/>
+          <w:szCs w:val="24"/>
+          <w:lang w:val="en-GB"/>
+        </w:rPr>
+        <w:t>@RequestMapping(</w:t>
+      </w:r>
+      <w:proofErr w:type="gramEnd"/>
+      <w:r>
+        <w:rPr>
+          <w:rFonts w:asciiTheme="majorHAnsi" w:hAnsiTheme="majorHAnsi"/>
+          <w:sz w:val="24"/>
+          <w:szCs w:val="24"/>
+          <w:lang w:val="en-GB"/>
+        </w:rPr>
+        <w:t>"/</w:t>
+      </w:r>
+      <w:proofErr w:type="spellStart"/>
+      <w:r>
+        <w:rPr>
+          <w:rFonts w:asciiTheme="majorHAnsi" w:hAnsiTheme="majorHAnsi"/>
+          <w:sz w:val="24"/>
+          <w:szCs w:val="24"/>
+          <w:lang w:val="en-GB"/>
+        </w:rPr>
+        <w:t>url</w:t>
+      </w:r>
+      <w:proofErr w:type="spellEnd"/>
+      <w:r>
+        <w:rPr>
+          <w:rFonts w:asciiTheme="majorHAnsi" w:hAnsiTheme="majorHAnsi"/>
+          <w:sz w:val="24"/>
+          <w:szCs w:val="24"/>
+          <w:lang w:val="en-GB"/>
+        </w:rPr>
+        <w:t xml:space="preserve">") :- by default it is </w:t>
+      </w:r>
+      <w:r>
+        <w:rPr>
+          <w:rFonts w:asciiTheme="majorHAnsi" w:hAnsiTheme="majorHAnsi"/>
+          <w:sz w:val="24"/>
+          <w:szCs w:val="24"/>
+          <w:lang w:val="en-GB"/>
+        </w:rPr>
+        <w:t>‘</w:t>
+      </w:r>
+      <w:r>
+        <w:rPr>
+          <w:rFonts w:asciiTheme="majorHAnsi" w:hAnsiTheme="majorHAnsi"/>
+          <w:sz w:val="24"/>
+          <w:szCs w:val="24"/>
+          <w:lang w:val="en-GB"/>
+        </w:rPr>
+        <w:t>Get</w:t>
+      </w:r>
+      <w:r>
+        <w:rPr>
+          <w:rFonts w:asciiTheme="majorHAnsi" w:hAnsiTheme="majorHAnsi"/>
+          <w:sz w:val="24"/>
+          <w:szCs w:val="24"/>
+          <w:lang w:val="en-GB"/>
+        </w:rPr>
+        <w:t>’</w:t>
+      </w:r>
+      <w:r>
+        <w:rPr>
+          <w:rFonts w:asciiTheme="majorHAnsi" w:hAnsiTheme="majorHAnsi"/>
+          <w:sz w:val="24"/>
+          <w:szCs w:val="24"/>
+          <w:lang w:val="en-GB"/>
+        </w:rPr>
+        <w:t xml:space="preserve"> method. Syntax</w:t>
+      </w:r>
+      <w:proofErr w:type="gramStart"/>
+      <w:r>
+        <w:rPr>
+          <w:rFonts w:asciiTheme="majorHAnsi" w:hAnsiTheme="majorHAnsi"/>
+          <w:sz w:val="24"/>
+          <w:szCs w:val="24"/>
+          <w:lang w:val="en-GB"/>
+        </w:rPr>
+        <w:t>:-</w:t>
+      </w:r>
+      <w:proofErr w:type="gramEnd"/>
+      <w:r>
+        <w:rPr>
+          <w:rFonts w:asciiTheme="majorHAnsi" w:hAnsiTheme="majorHAnsi"/>
+          <w:sz w:val="24"/>
+          <w:szCs w:val="24"/>
+          <w:lang w:val="en-GB"/>
+        </w:rPr>
+        <w:t xml:space="preserve"> @RequestMapping(path="/path-</w:t>
+      </w:r>
+      <w:proofErr w:type="spellStart"/>
+      <w:r>
+        <w:rPr>
+          <w:rFonts w:asciiTheme="majorHAnsi" w:hAnsiTheme="majorHAnsi"/>
+          <w:sz w:val="24"/>
+          <w:szCs w:val="24"/>
+          <w:lang w:val="en-GB"/>
+        </w:rPr>
+        <w:t>name",method</w:t>
+      </w:r>
+      <w:proofErr w:type="spellEnd"/>
+      <w:r>
+        <w:rPr>
+          <w:rFonts w:asciiTheme="majorHAnsi" w:hAnsiTheme="majorHAnsi"/>
+          <w:sz w:val="24"/>
+          <w:szCs w:val="24"/>
+          <w:lang w:val="en-GB"/>
+        </w:rPr>
+        <w:t xml:space="preserve"> = "</w:t>
+      </w:r>
+      <w:proofErr w:type="spellStart"/>
+      <w:r>
+        <w:rPr>
+          <w:rFonts w:asciiTheme="majorHAnsi" w:hAnsiTheme="majorHAnsi"/>
+          <w:sz w:val="24"/>
+          <w:szCs w:val="24"/>
+          <w:lang w:val="en-GB"/>
+        </w:rPr>
+        <w:t>RequestMethod.Get</w:t>
+      </w:r>
+      <w:proofErr w:type="spellEnd"/>
+      <w:r>
+        <w:rPr>
+          <w:rFonts w:asciiTheme="majorHAnsi" w:hAnsiTheme="majorHAnsi"/>
+          <w:sz w:val="24"/>
+          <w:szCs w:val="24"/>
+          <w:lang w:val="en-GB"/>
+        </w:rPr>
+        <w:t>")</w:t>
+      </w:r>
+      <w:r>
+        <w:rPr>
+          <w:rFonts w:asciiTheme="majorHAnsi" w:hAnsiTheme="majorHAnsi"/>
+          <w:sz w:val="24"/>
+          <w:szCs w:val="24"/>
+          <w:lang w:val="en-GB"/>
+        </w:rPr>
+        <w:t>.</w:t>
+      </w:r>
+    </w:p>
+    <w:p>
+      <w:pPr>
+        <w:pStyle w:val="ListParagraph"/>
+        <w:numPr>
+          <w:ilvl w:val="0"/>
+          <w:numId w:val="3"/>
+        </w:numPr>
+        <w:rPr>
+          <w:rFonts w:asciiTheme="majorHAnsi" w:hAnsiTheme="majorHAnsi"/>
+          <w:sz w:val="24"/>
+          <w:szCs w:val="24"/>
+          <w:lang w:val="en-GB"/>
+        </w:rPr>
+      </w:pPr>
+      <w:r>
+        <w:rPr>
+          <w:rFonts w:asciiTheme="majorHAnsi" w:hAnsiTheme="majorHAnsi"/>
+          <w:sz w:val="24"/>
+          <w:szCs w:val="24"/>
           <w:lang w:val="en-GB"/>
         </w:rPr>
         <w:t>@</w:t>
@@ -429,11 +2029,43 @@
       <w:proofErr w:type="spellStart"/>
       <w:r>
         <w:rPr>
-          <w:lang w:val="en-GB"/>
-        </w:rPr>
-        <w:t>RestController</w:t>
-      </w:r>
-      <w:proofErr w:type="spellEnd"/>
+          <w:rFonts w:asciiTheme="majorHAnsi" w:hAnsiTheme="majorHAnsi"/>
+          <w:sz w:val="24"/>
+          <w:szCs w:val="24"/>
+          <w:lang w:val="en-GB"/>
+        </w:rPr>
+        <w:t>RequestParam</w:t>
+      </w:r>
+      <w:proofErr w:type="spellEnd"/>
+      <w:r>
+        <w:rPr>
+          <w:rFonts w:asciiTheme="majorHAnsi" w:hAnsiTheme="majorHAnsi"/>
+          <w:sz w:val="24"/>
+          <w:szCs w:val="24"/>
+          <w:lang w:val="en-GB"/>
+        </w:rPr>
+        <w:t>("</w:t>
+      </w:r>
+      <w:proofErr w:type="spellStart"/>
+      <w:r>
+        <w:rPr>
+          <w:rFonts w:asciiTheme="majorHAnsi" w:hAnsiTheme="majorHAnsi"/>
+          <w:sz w:val="24"/>
+          <w:szCs w:val="24"/>
+          <w:lang w:val="en-GB"/>
+        </w:rPr>
+        <w:t>param</w:t>
+      </w:r>
+      <w:proofErr w:type="spellEnd"/>
+      <w:r>
+        <w:rPr>
+          <w:rFonts w:asciiTheme="majorHAnsi" w:hAnsiTheme="majorHAnsi"/>
+          <w:sz w:val="24"/>
+          <w:szCs w:val="24"/>
+          <w:lang w:val="en-GB"/>
+        </w:rPr>
+        <w:t>")</w:t>
+      </w:r>
     </w:p>
     <w:p>
       <w:pPr>
@@ -443,15 +2075,94 @@
           <w:numId w:val="3"/>
         </w:numPr>
         <w:rPr>
-          <w:lang w:val="en-GB"/>
-        </w:rPr>
-      </w:pPr>
-      <w:r>
-        <w:rPr>
+          <w:rFonts w:asciiTheme="majorHAnsi" w:hAnsiTheme="majorHAnsi"/>
+          <w:sz w:val="24"/>
+          <w:szCs w:val="24"/>
+          <w:lang w:val="en-GB"/>
+        </w:rPr>
+      </w:pPr>
+      <w:r>
+        <w:rPr>
+          <w:rFonts w:asciiTheme="majorHAnsi" w:hAnsiTheme="majorHAnsi"/>
+          <w:sz w:val="24"/>
+          <w:szCs w:val="24"/>
+          <w:lang w:val="en-GB"/>
+        </w:rPr>
+        <w:t>@</w:t>
+      </w:r>
+      <w:proofErr w:type="spellStart"/>
+      <w:proofErr w:type="gramStart"/>
+      <w:r>
+        <w:rPr>
+          <w:rFonts w:asciiTheme="majorHAnsi" w:hAnsiTheme="majorHAnsi"/>
+          <w:sz w:val="24"/>
+          <w:szCs w:val="24"/>
+          <w:lang w:val="en-GB"/>
+        </w:rPr>
+        <w:t>ResponseBody</w:t>
+      </w:r>
+      <w:proofErr w:type="spellEnd"/>
+      <w:r>
+        <w:rPr>
+          <w:rFonts w:asciiTheme="majorHAnsi" w:hAnsiTheme="majorHAnsi"/>
+          <w:sz w:val="24"/>
+          <w:szCs w:val="24"/>
+          <w:lang w:val="en-GB"/>
+        </w:rPr>
+        <w:t xml:space="preserve"> :-</w:t>
+      </w:r>
+      <w:proofErr w:type="gramEnd"/>
+      <w:r>
+        <w:rPr>
+          <w:rFonts w:asciiTheme="majorHAnsi" w:hAnsiTheme="majorHAnsi"/>
+          <w:sz w:val="24"/>
+          <w:szCs w:val="24"/>
+          <w:lang w:val="en-GB"/>
+        </w:rPr>
+        <w:t xml:space="preserve">  binds a method return value to the web response body. It is not interpreted as a view name.</w:t>
+      </w:r>
+    </w:p>
+    <w:p>
+      <w:pPr>
+        <w:pStyle w:val="ListParagraph"/>
+        <w:numPr>
+          <w:ilvl w:val="0"/>
+          <w:numId w:val="3"/>
+        </w:numPr>
+        <w:rPr>
+          <w:rFonts w:asciiTheme="majorHAnsi" w:hAnsiTheme="majorHAnsi"/>
+          <w:sz w:val="24"/>
+          <w:szCs w:val="24"/>
+          <w:lang w:val="en-GB"/>
+        </w:rPr>
+      </w:pPr>
+      <w:r>
+        <w:rPr>
+          <w:rFonts w:asciiTheme="majorHAnsi" w:hAnsiTheme="majorHAnsi"/>
+          <w:sz w:val="24"/>
+          <w:szCs w:val="24"/>
           <w:lang w:val="en-GB"/>
         </w:rPr>
         <w:t>@Service</w:t>
       </w:r>
+      <w:r>
+        <w:rPr>
+          <w:rFonts w:asciiTheme="majorHAnsi" w:hAnsiTheme="majorHAnsi"/>
+          <w:sz w:val="24"/>
+          <w:szCs w:val="24"/>
+          <w:lang w:val="en-GB"/>
+        </w:rPr>
+        <w:t xml:space="preserve">: </w:t>
+      </w:r>
+      <w:r>
+        <w:rPr>
+          <w:rFonts w:asciiTheme="majorHAnsi" w:hAnsiTheme="majorHAnsi"/>
+          <w:sz w:val="24"/>
+          <w:szCs w:val="24"/>
+          <w:lang w:val="en-GB"/>
+        </w:rPr>
+        <w:t>Tells Spring boot that the class belongs to service layer. Controller Class always calls a service class.</w:t>
+      </w:r>
     </w:p>
     <w:p>
       <w:pPr>
@@ -461,32 +2172,235 @@
           <w:numId w:val="3"/>
         </w:numPr>
         <w:rPr>
-          <w:lang w:val="en-GB"/>
-        </w:rPr>
-      </w:pPr>
-      <w:r>
-        <w:rPr>
+          <w:rFonts w:asciiTheme="majorHAnsi" w:hAnsiTheme="majorHAnsi"/>
+          <w:sz w:val="24"/>
+          <w:szCs w:val="24"/>
+          <w:lang w:val="en-GB"/>
+        </w:rPr>
+      </w:pPr>
+      <w:r>
+        <w:rPr>
+          <w:rFonts w:asciiTheme="majorHAnsi" w:hAnsiTheme="majorHAnsi"/>
+          <w:sz w:val="24"/>
+          <w:szCs w:val="24"/>
           <w:lang w:val="en-GB"/>
         </w:rPr>
         <w:t>@</w:t>
       </w:r>
       <w:proofErr w:type="spellStart"/>
-      <w:r>
-        <w:rPr>
+      <w:proofErr w:type="gramStart"/>
+      <w:r>
+        <w:rPr>
+          <w:rFonts w:asciiTheme="majorHAnsi" w:hAnsiTheme="majorHAnsi"/>
+          <w:sz w:val="24"/>
+          <w:szCs w:val="24"/>
+          <w:lang w:val="en-GB"/>
+        </w:rPr>
+        <w:t>SpringBootApplication</w:t>
+      </w:r>
+      <w:proofErr w:type="spellEnd"/>
+      <w:r>
+        <w:rPr>
+          <w:rFonts w:asciiTheme="majorHAnsi" w:hAnsiTheme="majorHAnsi"/>
+          <w:sz w:val="24"/>
+          <w:szCs w:val="24"/>
+          <w:lang w:val="en-GB"/>
+        </w:rPr>
+        <w:t xml:space="preserve"> :-</w:t>
+      </w:r>
+      <w:proofErr w:type="gramEnd"/>
+      <w:r>
+        <w:rPr>
+          <w:rFonts w:asciiTheme="majorHAnsi" w:hAnsiTheme="majorHAnsi"/>
+          <w:sz w:val="24"/>
+          <w:szCs w:val="24"/>
+          <w:lang w:val="en-GB"/>
+        </w:rPr>
+        <w:t xml:space="preserve"> used to create spring boot application. It is equivalent to @</w:t>
+      </w:r>
+      <w:proofErr w:type="spellStart"/>
+      <w:r>
+        <w:rPr>
+          <w:rFonts w:asciiTheme="majorHAnsi" w:hAnsiTheme="majorHAnsi"/>
+          <w:sz w:val="24"/>
+          <w:szCs w:val="24"/>
           <w:lang w:val="en-GB"/>
         </w:rPr>
         <w:t>SpringBootConfiguration</w:t>
       </w:r>
       <w:proofErr w:type="spellEnd"/>
-    </w:p>
-    <w:p>
-      <w:pPr>
-        <w:rPr>
-          <w:lang w:val="en-GB"/>
-        </w:rPr>
-      </w:pPr>
-      <w:r>
-        <w:rPr>
+      <w:r>
+        <w:rPr>
+          <w:rFonts w:asciiTheme="majorHAnsi" w:hAnsiTheme="majorHAnsi"/>
+          <w:sz w:val="24"/>
+          <w:szCs w:val="24"/>
+          <w:lang w:val="en-GB"/>
+        </w:rPr>
+        <w:t>, @</w:t>
+      </w:r>
+      <w:proofErr w:type="spellStart"/>
+      <w:r>
+        <w:rPr>
+          <w:rFonts w:asciiTheme="majorHAnsi" w:hAnsiTheme="majorHAnsi"/>
+          <w:sz w:val="24"/>
+          <w:szCs w:val="24"/>
+          <w:lang w:val="en-GB"/>
+        </w:rPr>
+        <w:t>ComponentScan</w:t>
+      </w:r>
+      <w:proofErr w:type="spellEnd"/>
+      <w:r>
+        <w:rPr>
+          <w:rFonts w:asciiTheme="majorHAnsi" w:hAnsiTheme="majorHAnsi"/>
+          <w:sz w:val="24"/>
+          <w:szCs w:val="24"/>
+          <w:lang w:val="en-GB"/>
+        </w:rPr>
+        <w:t>, @</w:t>
+      </w:r>
+      <w:proofErr w:type="spellStart"/>
+      <w:r>
+        <w:rPr>
+          <w:rFonts w:asciiTheme="majorHAnsi" w:hAnsiTheme="majorHAnsi"/>
+          <w:sz w:val="24"/>
+          <w:szCs w:val="24"/>
+          <w:lang w:val="en-GB"/>
+        </w:rPr>
+        <w:t>EnableAutoConfiguration</w:t>
+      </w:r>
+      <w:proofErr w:type="spellEnd"/>
+    </w:p>
+    <w:p>
+      <w:pPr>
+        <w:pStyle w:val="ListParagraph"/>
+        <w:numPr>
+          <w:ilvl w:val="0"/>
+          <w:numId w:val="3"/>
+        </w:numPr>
+        <w:rPr>
+          <w:rFonts w:asciiTheme="majorHAnsi" w:hAnsiTheme="majorHAnsi"/>
+          <w:sz w:val="24"/>
+          <w:szCs w:val="24"/>
+          <w:lang w:val="en-GB"/>
+        </w:rPr>
+      </w:pPr>
+      <w:r>
+        <w:rPr>
+          <w:rFonts w:asciiTheme="majorHAnsi" w:hAnsiTheme="majorHAnsi"/>
+          <w:sz w:val="24"/>
+          <w:szCs w:val="24"/>
+          <w:lang w:val="en-GB"/>
+        </w:rPr>
+        <w:t>@</w:t>
+      </w:r>
+      <w:proofErr w:type="spellStart"/>
+      <w:r>
+        <w:rPr>
+          <w:rFonts w:asciiTheme="majorHAnsi" w:hAnsiTheme="majorHAnsi"/>
+          <w:sz w:val="24"/>
+          <w:szCs w:val="24"/>
+          <w:lang w:val="en-GB"/>
+        </w:rPr>
+        <w:t>SpringBootConfiguration</w:t>
+      </w:r>
+      <w:proofErr w:type="spellEnd"/>
+      <w:r>
+        <w:rPr>
+          <w:rFonts w:asciiTheme="majorHAnsi" w:hAnsiTheme="majorHAnsi"/>
+          <w:sz w:val="24"/>
+          <w:szCs w:val="24"/>
+          <w:lang w:val="en-GB"/>
+        </w:rPr>
+        <w:t xml:space="preserve">: </w:t>
+      </w:r>
+      <w:r>
+        <w:rPr>
+          <w:rFonts w:asciiTheme="majorHAnsi" w:hAnsiTheme="majorHAnsi"/>
+          <w:sz w:val="24"/>
+          <w:szCs w:val="24"/>
+          <w:lang w:val="en-GB"/>
+        </w:rPr>
+        <w:t>It internally uses @Configuration, thus we can say that it is an implementation of @Configuration.</w:t>
+      </w:r>
+    </w:p>
+    <w:p>
+      <w:pPr>
+        <w:pStyle w:val="ListParagraph"/>
+        <w:numPr>
+          <w:ilvl w:val="0"/>
+          <w:numId w:val="3"/>
+        </w:numPr>
+        <w:rPr>
+          <w:rFonts w:asciiTheme="majorHAnsi" w:hAnsiTheme="majorHAnsi"/>
+          <w:sz w:val="24"/>
+          <w:szCs w:val="24"/>
+          <w:lang w:val="en-GB"/>
+        </w:rPr>
+      </w:pPr>
+      <w:r>
+        <w:rPr>
+          <w:rFonts w:asciiTheme="majorHAnsi" w:hAnsiTheme="majorHAnsi"/>
+          <w:sz w:val="24"/>
+          <w:szCs w:val="24"/>
+          <w:lang w:val="en-GB"/>
+        </w:rPr>
+        <w:t>@</w:t>
+      </w:r>
+      <w:proofErr w:type="gramStart"/>
+      <w:r>
+        <w:rPr>
+          <w:rFonts w:asciiTheme="majorHAnsi" w:hAnsiTheme="majorHAnsi"/>
+          <w:sz w:val="24"/>
+          <w:szCs w:val="24"/>
+          <w:lang w:val="en-GB"/>
+        </w:rPr>
+        <w:t>Value :-</w:t>
+      </w:r>
+      <w:proofErr w:type="gramEnd"/>
+      <w:r>
+        <w:rPr>
+          <w:rFonts w:asciiTheme="majorHAnsi" w:hAnsiTheme="majorHAnsi"/>
+          <w:sz w:val="24"/>
+          <w:szCs w:val="24"/>
+          <w:lang w:val="en-GB"/>
+        </w:rPr>
+        <w:t xml:space="preserve"> Helps us to use properties defined in </w:t>
+      </w:r>
+      <w:proofErr w:type="spellStart"/>
+      <w:r>
+        <w:rPr>
+          <w:rFonts w:asciiTheme="majorHAnsi" w:hAnsiTheme="majorHAnsi"/>
+          <w:sz w:val="24"/>
+          <w:szCs w:val="24"/>
+          <w:lang w:val="en-GB"/>
+        </w:rPr>
+        <w:t>application.properties</w:t>
+      </w:r>
+      <w:proofErr w:type="spellEnd"/>
+      <w:r>
+        <w:rPr>
+          <w:rFonts w:asciiTheme="majorHAnsi" w:hAnsiTheme="majorHAnsi"/>
+          <w:sz w:val="24"/>
+          <w:szCs w:val="24"/>
+          <w:lang w:val="en-GB"/>
+        </w:rPr>
+        <w:t>.</w:t>
+      </w:r>
+    </w:p>
+    <w:p>
+      <w:pPr>
+        <w:rPr>
+          <w:rFonts w:asciiTheme="majorHAnsi" w:hAnsiTheme="majorHAnsi"/>
+          <w:sz w:val="24"/>
+          <w:szCs w:val="24"/>
+          <w:lang w:val="en-GB"/>
+        </w:rPr>
+      </w:pPr>
+      <w:r>
+        <w:rPr>
+          <w:rFonts w:asciiTheme="majorHAnsi" w:hAnsiTheme="majorHAnsi"/>
+          <w:sz w:val="24"/>
+          <w:szCs w:val="24"/>
           <w:lang w:val="en-GB"/>
         </w:rPr>
         <w:br w:type="page"/>
@@ -495,11 +2409,17 @@
     <w:p>
       <w:pPr>
         <w:rPr>
-          <w:lang w:val="en-GB"/>
-        </w:rPr>
-      </w:pPr>
-      <w:r>
-        <w:rPr>
+          <w:rFonts w:asciiTheme="majorHAnsi" w:hAnsiTheme="majorHAnsi"/>
+          <w:sz w:val="24"/>
+          <w:szCs w:val="24"/>
+          <w:lang w:val="en-GB"/>
+        </w:rPr>
+      </w:pPr>
+      <w:r>
+        <w:rPr>
+          <w:rFonts w:asciiTheme="majorHAnsi" w:hAnsiTheme="majorHAnsi"/>
+          <w:sz w:val="24"/>
+          <w:szCs w:val="24"/>
           <w:lang w:val="en-GB"/>
         </w:rPr>
         <w:lastRenderedPageBreak/>
@@ -514,11 +2434,17 @@
           <w:numId w:val="1"/>
         </w:numPr>
         <w:rPr>
-          <w:lang w:val="en-GB"/>
-        </w:rPr>
-      </w:pPr>
-      <w:r>
-        <w:rPr>
+          <w:rFonts w:asciiTheme="majorHAnsi" w:hAnsiTheme="majorHAnsi"/>
+          <w:sz w:val="24"/>
+          <w:szCs w:val="24"/>
+          <w:lang w:val="en-GB"/>
+        </w:rPr>
+      </w:pPr>
+      <w:r>
+        <w:rPr>
+          <w:rFonts w:asciiTheme="majorHAnsi" w:hAnsiTheme="majorHAnsi"/>
+          <w:sz w:val="24"/>
+          <w:szCs w:val="24"/>
           <w:lang w:val="en-GB"/>
         </w:rPr>
         <w:t>@</w:t>
@@ -526,6 +2452,9 @@
       <w:proofErr w:type="spellStart"/>
       <w:r>
         <w:rPr>
+          <w:rFonts w:asciiTheme="majorHAnsi" w:hAnsiTheme="majorHAnsi"/>
+          <w:sz w:val="24"/>
+          <w:szCs w:val="24"/>
           <w:lang w:val="en-GB"/>
         </w:rPr>
         <w:t>AuthenticationPrincipal</w:t>
@@ -540,11 +2469,17 @@
           <w:numId w:val="1"/>
         </w:numPr>
         <w:rPr>
-          <w:lang w:val="en-GB"/>
-        </w:rPr>
-      </w:pPr>
-      <w:r>
-        <w:rPr>
+          <w:rFonts w:asciiTheme="majorHAnsi" w:hAnsiTheme="majorHAnsi"/>
+          <w:sz w:val="24"/>
+          <w:szCs w:val="24"/>
+          <w:lang w:val="en-GB"/>
+        </w:rPr>
+      </w:pPr>
+      <w:r>
+        <w:rPr>
+          <w:rFonts w:asciiTheme="majorHAnsi" w:hAnsiTheme="majorHAnsi"/>
+          <w:sz w:val="24"/>
+          <w:szCs w:val="24"/>
           <w:lang w:val="en-GB"/>
         </w:rPr>
         <w:t>@</w:t>
@@ -552,6 +2487,9 @@
       <w:proofErr w:type="spellStart"/>
       <w:r>
         <w:rPr>
+          <w:rFonts w:asciiTheme="majorHAnsi" w:hAnsiTheme="majorHAnsi"/>
+          <w:sz w:val="24"/>
+          <w:szCs w:val="24"/>
           <w:lang w:val="en-GB"/>
         </w:rPr>
         <w:t>EnableMethodSecurity</w:t>
@@ -566,11 +2504,17 @@
           <w:numId w:val="1"/>
         </w:numPr>
         <w:rPr>
-          <w:lang w:val="en-GB"/>
-        </w:rPr>
-      </w:pPr>
-      <w:r>
-        <w:rPr>
+          <w:rFonts w:asciiTheme="majorHAnsi" w:hAnsiTheme="majorHAnsi"/>
+          <w:sz w:val="24"/>
+          <w:szCs w:val="24"/>
+          <w:lang w:val="en-GB"/>
+        </w:rPr>
+      </w:pPr>
+      <w:r>
+        <w:rPr>
+          <w:rFonts w:asciiTheme="majorHAnsi" w:hAnsiTheme="majorHAnsi"/>
+          <w:sz w:val="24"/>
+          <w:szCs w:val="24"/>
           <w:lang w:val="en-GB"/>
         </w:rPr>
         <w:t>@</w:t>
@@ -578,6 +2522,9 @@
       <w:proofErr w:type="spellStart"/>
       <w:r>
         <w:rPr>
+          <w:rFonts w:asciiTheme="majorHAnsi" w:hAnsiTheme="majorHAnsi"/>
+          <w:sz w:val="24"/>
+          <w:szCs w:val="24"/>
           <w:lang w:val="en-GB"/>
         </w:rPr>
         <w:t>EnableWebSecurity</w:t>
@@ -592,11 +2539,17 @@
           <w:numId w:val="1"/>
         </w:numPr>
         <w:rPr>
-          <w:lang w:val="en-GB"/>
-        </w:rPr>
-      </w:pPr>
-      <w:r>
-        <w:rPr>
+          <w:rFonts w:asciiTheme="majorHAnsi" w:hAnsiTheme="majorHAnsi"/>
+          <w:sz w:val="24"/>
+          <w:szCs w:val="24"/>
+          <w:lang w:val="en-GB"/>
+        </w:rPr>
+      </w:pPr>
+      <w:r>
+        <w:rPr>
+          <w:rFonts w:asciiTheme="majorHAnsi" w:hAnsiTheme="majorHAnsi"/>
+          <w:sz w:val="24"/>
+          <w:szCs w:val="24"/>
           <w:lang w:val="en-GB"/>
         </w:rPr>
         <w:t>@</w:t>
@@ -604,6 +2557,9 @@
       <w:proofErr w:type="spellStart"/>
       <w:r>
         <w:rPr>
+          <w:rFonts w:asciiTheme="majorHAnsi" w:hAnsiTheme="majorHAnsi"/>
+          <w:sz w:val="24"/>
+          <w:szCs w:val="24"/>
           <w:lang w:val="en-GB"/>
         </w:rPr>
         <w:t>PostAuthorize</w:t>
@@ -618,11 +2574,17 @@
           <w:numId w:val="1"/>
         </w:numPr>
         <w:rPr>
-          <w:lang w:val="en-GB"/>
-        </w:rPr>
-      </w:pPr>
-      <w:r>
-        <w:rPr>
+          <w:rFonts w:asciiTheme="majorHAnsi" w:hAnsiTheme="majorHAnsi"/>
+          <w:sz w:val="24"/>
+          <w:szCs w:val="24"/>
+          <w:lang w:val="en-GB"/>
+        </w:rPr>
+      </w:pPr>
+      <w:r>
+        <w:rPr>
+          <w:rFonts w:asciiTheme="majorHAnsi" w:hAnsiTheme="majorHAnsi"/>
+          <w:sz w:val="24"/>
+          <w:szCs w:val="24"/>
           <w:lang w:val="en-GB"/>
         </w:rPr>
         <w:t>@</w:t>
@@ -630,6 +2592,9 @@
       <w:proofErr w:type="spellStart"/>
       <w:r>
         <w:rPr>
+          <w:rFonts w:asciiTheme="majorHAnsi" w:hAnsiTheme="majorHAnsi"/>
+          <w:sz w:val="24"/>
+          <w:szCs w:val="24"/>
           <w:lang w:val="en-GB"/>
         </w:rPr>
         <w:t>PostFilter</w:t>
@@ -644,11 +2609,17 @@
           <w:numId w:val="1"/>
         </w:numPr>
         <w:rPr>
-          <w:lang w:val="en-GB"/>
-        </w:rPr>
-      </w:pPr>
-      <w:r>
-        <w:rPr>
+          <w:rFonts w:asciiTheme="majorHAnsi" w:hAnsiTheme="majorHAnsi"/>
+          <w:sz w:val="24"/>
+          <w:szCs w:val="24"/>
+          <w:lang w:val="en-GB"/>
+        </w:rPr>
+      </w:pPr>
+      <w:r>
+        <w:rPr>
+          <w:rFonts w:asciiTheme="majorHAnsi" w:hAnsiTheme="majorHAnsi"/>
+          <w:sz w:val="24"/>
+          <w:szCs w:val="24"/>
           <w:lang w:val="en-GB"/>
         </w:rPr>
         <w:t>@</w:t>
@@ -656,6 +2627,9 @@
       <w:proofErr w:type="spellStart"/>
       <w:r>
         <w:rPr>
+          <w:rFonts w:asciiTheme="majorHAnsi" w:hAnsiTheme="majorHAnsi"/>
+          <w:sz w:val="24"/>
+          <w:szCs w:val="24"/>
           <w:lang w:val="en-GB"/>
         </w:rPr>
         <w:t>PreAuthorize</w:t>
@@ -670,11 +2644,17 @@
           <w:numId w:val="1"/>
         </w:numPr>
         <w:rPr>
-          <w:lang w:val="en-GB"/>
-        </w:rPr>
-      </w:pPr>
-      <w:r>
-        <w:rPr>
+          <w:rFonts w:asciiTheme="majorHAnsi" w:hAnsiTheme="majorHAnsi"/>
+          <w:sz w:val="24"/>
+          <w:szCs w:val="24"/>
+          <w:lang w:val="en-GB"/>
+        </w:rPr>
+      </w:pPr>
+      <w:r>
+        <w:rPr>
+          <w:rFonts w:asciiTheme="majorHAnsi" w:hAnsiTheme="majorHAnsi"/>
+          <w:sz w:val="24"/>
+          <w:szCs w:val="24"/>
           <w:lang w:val="en-GB"/>
         </w:rPr>
         <w:t>@</w:t>
@@ -682,6 +2662,9 @@
       <w:proofErr w:type="spellStart"/>
       <w:r>
         <w:rPr>
+          <w:rFonts w:asciiTheme="majorHAnsi" w:hAnsiTheme="majorHAnsi"/>
+          <w:sz w:val="24"/>
+          <w:szCs w:val="24"/>
           <w:lang w:val="en-GB"/>
         </w:rPr>
         <w:t>PreFilter</w:t>
@@ -696,11 +2679,17 @@
           <w:numId w:val="1"/>
         </w:numPr>
         <w:rPr>
-          <w:lang w:val="en-GB"/>
-        </w:rPr>
-      </w:pPr>
-      <w:r>
-        <w:rPr>
+          <w:rFonts w:asciiTheme="majorHAnsi" w:hAnsiTheme="majorHAnsi"/>
+          <w:sz w:val="24"/>
+          <w:szCs w:val="24"/>
+          <w:lang w:val="en-GB"/>
+        </w:rPr>
+      </w:pPr>
+      <w:r>
+        <w:rPr>
+          <w:rFonts w:asciiTheme="majorHAnsi" w:hAnsiTheme="majorHAnsi"/>
+          <w:sz w:val="24"/>
+          <w:szCs w:val="24"/>
           <w:lang w:val="en-GB"/>
         </w:rPr>
         <w:t>@</w:t>
@@ -708,6 +2697,9 @@
       <w:proofErr w:type="spellStart"/>
       <w:r>
         <w:rPr>
+          <w:rFonts w:asciiTheme="majorHAnsi" w:hAnsiTheme="majorHAnsi"/>
+          <w:sz w:val="24"/>
+          <w:szCs w:val="24"/>
           <w:lang w:val="en-GB"/>
         </w:rPr>
         <w:t>RolesAllowed</w:t>
@@ -722,11 +2714,17 @@
           <w:numId w:val="1"/>
         </w:numPr>
         <w:rPr>
-          <w:lang w:val="en-GB"/>
-        </w:rPr>
-      </w:pPr>
-      <w:r>
-        <w:rPr>
+          <w:rFonts w:asciiTheme="majorHAnsi" w:hAnsiTheme="majorHAnsi"/>
+          <w:sz w:val="24"/>
+          <w:szCs w:val="24"/>
+          <w:lang w:val="en-GB"/>
+        </w:rPr>
+      </w:pPr>
+      <w:r>
+        <w:rPr>
+          <w:rFonts w:asciiTheme="majorHAnsi" w:hAnsiTheme="majorHAnsi"/>
+          <w:sz w:val="24"/>
+          <w:szCs w:val="24"/>
           <w:lang w:val="en-GB"/>
         </w:rPr>
         <w:t>@Secured</w:t>
@@ -735,11 +2733,17 @@
     <w:p>
       <w:pPr>
         <w:rPr>
-          <w:lang w:val="en-GB"/>
-        </w:rPr>
-      </w:pPr>
-      <w:r>
-        <w:rPr>
+          <w:rFonts w:asciiTheme="majorHAnsi" w:hAnsiTheme="majorHAnsi"/>
+          <w:sz w:val="24"/>
+          <w:szCs w:val="24"/>
+          <w:lang w:val="en-GB"/>
+        </w:rPr>
+      </w:pPr>
+      <w:r>
+        <w:rPr>
+          <w:rFonts w:asciiTheme="majorHAnsi" w:hAnsiTheme="majorHAnsi"/>
+          <w:sz w:val="24"/>
+          <w:szCs w:val="24"/>
           <w:lang w:val="en-GB"/>
         </w:rPr>
         <w:br w:type="page"/>
@@ -748,11 +2752,17 @@
     <w:p>
       <w:pPr>
         <w:rPr>
-          <w:lang w:val="en-GB"/>
-        </w:rPr>
-      </w:pPr>
-      <w:r>
-        <w:rPr>
+          <w:rFonts w:asciiTheme="majorHAnsi" w:hAnsiTheme="majorHAnsi"/>
+          <w:sz w:val="24"/>
+          <w:szCs w:val="24"/>
+          <w:lang w:val="en-GB"/>
+        </w:rPr>
+      </w:pPr>
+      <w:r>
+        <w:rPr>
+          <w:rFonts w:asciiTheme="majorHAnsi" w:hAnsiTheme="majorHAnsi"/>
+          <w:sz w:val="24"/>
+          <w:szCs w:val="24"/>
           <w:lang w:val="en-GB"/>
         </w:rPr>
         <w:lastRenderedPageBreak/>
@@ -767,11 +2777,17 @@
           <w:numId w:val="4"/>
         </w:numPr>
         <w:rPr>
-          <w:lang w:val="en-GB"/>
-        </w:rPr>
-      </w:pPr>
-      <w:r>
-        <w:rPr>
+          <w:rFonts w:asciiTheme="majorHAnsi" w:hAnsiTheme="majorHAnsi"/>
+          <w:sz w:val="24"/>
+          <w:szCs w:val="24"/>
+          <w:lang w:val="en-GB"/>
+        </w:rPr>
+      </w:pPr>
+      <w:r>
+        <w:rPr>
+          <w:rFonts w:asciiTheme="majorHAnsi" w:hAnsiTheme="majorHAnsi"/>
+          <w:sz w:val="24"/>
+          <w:szCs w:val="24"/>
           <w:lang w:val="en-GB"/>
         </w:rPr>
         <w:t>@Column</w:t>
@@ -785,11 +2801,17 @@
           <w:numId w:val="4"/>
         </w:numPr>
         <w:rPr>
-          <w:lang w:val="en-GB"/>
-        </w:rPr>
-      </w:pPr>
-      <w:r>
-        <w:rPr>
+          <w:rFonts w:asciiTheme="majorHAnsi" w:hAnsiTheme="majorHAnsi"/>
+          <w:sz w:val="24"/>
+          <w:szCs w:val="24"/>
+          <w:lang w:val="en-GB"/>
+        </w:rPr>
+      </w:pPr>
+      <w:r>
+        <w:rPr>
+          <w:rFonts w:asciiTheme="majorHAnsi" w:hAnsiTheme="majorHAnsi"/>
+          <w:sz w:val="24"/>
+          <w:szCs w:val="24"/>
           <w:lang w:val="en-GB"/>
         </w:rPr>
         <w:t>@</w:t>
@@ -797,11 +2819,23 @@
       <w:proofErr w:type="spellStart"/>
       <w:r>
         <w:rPr>
+          <w:rFonts w:asciiTheme="majorHAnsi" w:hAnsiTheme="majorHAnsi"/>
+          <w:sz w:val="24"/>
+          <w:szCs w:val="24"/>
           <w:lang w:val="en-GB"/>
         </w:rPr>
         <w:t>CreationTimeStamp</w:t>
       </w:r>
       <w:proofErr w:type="spellEnd"/>
+      <w:r>
+        <w:rPr>
+          <w:rFonts w:asciiTheme="majorHAnsi" w:hAnsiTheme="majorHAnsi"/>
+          <w:sz w:val="24"/>
+          <w:szCs w:val="24"/>
+          <w:lang w:val="en-GB"/>
+        </w:rPr>
+        <w:t xml:space="preserve">: </w:t>
+      </w:r>
     </w:p>
     <w:p>
       <w:pPr>
@@ -811,14 +2845,20 @@
           <w:numId w:val="4"/>
         </w:numPr>
         <w:rPr>
-          <w:lang w:val="en-GB"/>
-        </w:rPr>
-      </w:pPr>
-      <w:r>
-        <w:rPr>
-          <w:lang w:val="en-GB"/>
-        </w:rPr>
-        <w:t>@Entity</w:t>
+          <w:rFonts w:asciiTheme="majorHAnsi" w:hAnsiTheme="majorHAnsi"/>
+          <w:sz w:val="24"/>
+          <w:szCs w:val="24"/>
+          <w:lang w:val="en-GB"/>
+        </w:rPr>
+      </w:pPr>
+      <w:r>
+        <w:rPr>
+          <w:rFonts w:asciiTheme="majorHAnsi" w:hAnsiTheme="majorHAnsi"/>
+          <w:sz w:val="24"/>
+          <w:szCs w:val="24"/>
+          <w:lang w:val="en-GB"/>
+        </w:rPr>
+        <w:t xml:space="preserve">@Data: </w:t>
       </w:r>
     </w:p>
     <w:p>
@@ -829,23 +2869,150 @@
           <w:numId w:val="4"/>
         </w:numPr>
         <w:rPr>
-          <w:lang w:val="en-GB"/>
-        </w:rPr>
-      </w:pPr>
-      <w:r>
-        <w:rPr>
+          <w:rFonts w:asciiTheme="majorHAnsi" w:hAnsiTheme="majorHAnsi"/>
+          <w:sz w:val="24"/>
+          <w:szCs w:val="24"/>
+          <w:lang w:val="en-GB"/>
+        </w:rPr>
+      </w:pPr>
+      <w:r>
+        <w:rPr>
+          <w:rFonts w:asciiTheme="majorHAnsi" w:hAnsiTheme="majorHAnsi"/>
+          <w:sz w:val="24"/>
+          <w:szCs w:val="24"/>
           <w:lang w:val="en-GB"/>
         </w:rPr>
         <w:t>@</w:t>
       </w:r>
-      <w:proofErr w:type="spellStart"/>
-      <w:r>
-        <w:rPr>
+      <w:r>
+        <w:rPr>
+          <w:rFonts w:asciiTheme="majorHAnsi" w:hAnsiTheme="majorHAnsi"/>
+          <w:sz w:val="24"/>
+          <w:szCs w:val="24"/>
+          <w:lang w:val="en-GB"/>
+        </w:rPr>
+        <w:t xml:space="preserve"> </w:t>
+      </w:r>
+      <w:r>
+        <w:rPr>
+          <w:rFonts w:asciiTheme="majorHAnsi" w:hAnsiTheme="majorHAnsi"/>
+          <w:sz w:val="24"/>
+          <w:szCs w:val="24"/>
+          <w:lang w:val="en-GB"/>
+        </w:rPr>
+        <w:t>Entity(name = "course"):- It marks a Java class as an entity, which means instances of this class represent persistent objects that need to be stored in a database.</w:t>
+      </w:r>
+      <w:r>
+        <w:rPr>
+          <w:rFonts w:asciiTheme="majorHAnsi" w:hAnsiTheme="majorHAnsi"/>
+          <w:sz w:val="24"/>
+          <w:szCs w:val="24"/>
+          <w:lang w:val="en-GB"/>
+        </w:rPr>
+        <w:t xml:space="preserve"> </w:t>
+      </w:r>
+      <w:r>
+        <w:rPr>
+          <w:rFonts w:asciiTheme="majorHAnsi" w:hAnsiTheme="majorHAnsi"/>
+          <w:sz w:val="24"/>
+          <w:szCs w:val="24"/>
+          <w:lang w:val="en-GB"/>
+        </w:rPr>
+        <w:t>It Maps Java class to the table</w:t>
+      </w:r>
+      <w:r>
+        <w:rPr>
+          <w:rFonts w:asciiTheme="majorHAnsi" w:hAnsiTheme="majorHAnsi"/>
+          <w:sz w:val="24"/>
+          <w:szCs w:val="24"/>
+          <w:lang w:val="en-GB"/>
+        </w:rPr>
+        <w:t>.</w:t>
+      </w:r>
+    </w:p>
+    <w:p>
+      <w:pPr>
+        <w:pStyle w:val="ListParagraph"/>
+        <w:numPr>
+          <w:ilvl w:val="0"/>
+          <w:numId w:val="4"/>
+        </w:numPr>
+        <w:rPr>
+          <w:rFonts w:asciiTheme="majorHAnsi" w:hAnsiTheme="majorHAnsi"/>
+          <w:sz w:val="24"/>
+          <w:szCs w:val="24"/>
+          <w:lang w:val="en-GB"/>
+        </w:rPr>
+      </w:pPr>
+      <w:r>
+        <w:rPr>
+          <w:rFonts w:asciiTheme="majorHAnsi" w:hAnsiTheme="majorHAnsi"/>
+          <w:sz w:val="24"/>
+          <w:szCs w:val="24"/>
+          <w:lang w:val="en-GB"/>
+        </w:rPr>
+        <w:t>@</w:t>
+      </w:r>
+      <w:r>
+        <w:rPr>
+          <w:rFonts w:asciiTheme="majorHAnsi" w:hAnsiTheme="majorHAnsi"/>
+          <w:sz w:val="24"/>
+          <w:szCs w:val="24"/>
+          <w:lang w:val="en-GB"/>
+        </w:rPr>
+        <w:t xml:space="preserve"> </w:t>
+      </w:r>
+      <w:proofErr w:type="spellStart"/>
+      <w:proofErr w:type="gramStart"/>
+      <w:r>
+        <w:rPr>
+          <w:rFonts w:asciiTheme="majorHAnsi" w:hAnsiTheme="majorHAnsi"/>
+          <w:sz w:val="24"/>
+          <w:szCs w:val="24"/>
           <w:lang w:val="en-GB"/>
         </w:rPr>
         <w:t>GeneratedValue</w:t>
       </w:r>
       <w:proofErr w:type="spellEnd"/>
+      <w:r>
+        <w:rPr>
+          <w:rFonts w:asciiTheme="majorHAnsi" w:hAnsiTheme="majorHAnsi"/>
+          <w:sz w:val="24"/>
+          <w:szCs w:val="24"/>
+          <w:lang w:val="en-GB"/>
+        </w:rPr>
+        <w:t>(</w:t>
+      </w:r>
+      <w:proofErr w:type="gramEnd"/>
+      <w:r>
+        <w:rPr>
+          <w:rFonts w:asciiTheme="majorHAnsi" w:hAnsiTheme="majorHAnsi"/>
+          <w:sz w:val="24"/>
+          <w:szCs w:val="24"/>
+          <w:lang w:val="en-GB"/>
+        </w:rPr>
+        <w:t xml:space="preserve">strategy= </w:t>
+      </w:r>
+      <w:proofErr w:type="spellStart"/>
+      <w:r>
+        <w:rPr>
+          <w:rFonts w:asciiTheme="majorHAnsi" w:hAnsiTheme="majorHAnsi"/>
+          <w:sz w:val="24"/>
+          <w:szCs w:val="24"/>
+          <w:lang w:val="en-GB"/>
+        </w:rPr>
+        <w:t>GenerationType.Auto</w:t>
+      </w:r>
+      <w:proofErr w:type="spellEnd"/>
+      <w:r>
+        <w:rPr>
+          <w:rFonts w:asciiTheme="majorHAnsi" w:hAnsiTheme="majorHAnsi"/>
+          <w:sz w:val="24"/>
+          <w:szCs w:val="24"/>
+          <w:lang w:val="en-GB"/>
+        </w:rPr>
+        <w:t>) :- It is used to automatically generate the value specially for id.</w:t>
+      </w:r>
     </w:p>
     <w:p>
       <w:pPr>
@@ -855,15 +3022,39 @@
           <w:numId w:val="4"/>
         </w:numPr>
         <w:rPr>
-          <w:lang w:val="en-GB"/>
-        </w:rPr>
-      </w:pPr>
-      <w:r>
-        <w:rPr>
+          <w:rFonts w:asciiTheme="majorHAnsi" w:hAnsiTheme="majorHAnsi"/>
+          <w:sz w:val="24"/>
+          <w:szCs w:val="24"/>
+          <w:lang w:val="en-GB"/>
+        </w:rPr>
+      </w:pPr>
+      <w:r>
+        <w:rPr>
+          <w:rFonts w:asciiTheme="majorHAnsi" w:hAnsiTheme="majorHAnsi"/>
+          <w:sz w:val="24"/>
+          <w:szCs w:val="24"/>
           <w:lang w:val="en-GB"/>
         </w:rPr>
         <w:t>@Id</w:t>
       </w:r>
+      <w:r>
+        <w:rPr>
+          <w:rFonts w:asciiTheme="majorHAnsi" w:hAnsiTheme="majorHAnsi"/>
+          <w:sz w:val="24"/>
+          <w:szCs w:val="24"/>
+          <w:lang w:val="en-GB"/>
+        </w:rPr>
+        <w:t xml:space="preserve">: </w:t>
+      </w:r>
+      <w:r>
+        <w:rPr>
+          <w:rFonts w:asciiTheme="majorHAnsi" w:hAnsiTheme="majorHAnsi"/>
+          <w:sz w:val="24"/>
+          <w:szCs w:val="24"/>
+          <w:lang w:val="en-GB"/>
+        </w:rPr>
+        <w:t>It is used to mark a primary key for a table in the entity.</w:t>
+      </w:r>
     </w:p>
     <w:p>
       <w:pPr>
@@ -873,15 +3064,41 @@
           <w:numId w:val="4"/>
         </w:numPr>
         <w:rPr>
-          <w:lang w:val="en-GB"/>
-        </w:rPr>
-      </w:pPr>
-      <w:r>
-        <w:rPr>
+          <w:rFonts w:asciiTheme="majorHAnsi" w:hAnsiTheme="majorHAnsi"/>
+          <w:sz w:val="24"/>
+          <w:szCs w:val="24"/>
+          <w:lang w:val="en-GB"/>
+        </w:rPr>
+      </w:pPr>
+      <w:proofErr w:type="gramStart"/>
+      <w:r>
+        <w:rPr>
+          <w:rFonts w:asciiTheme="majorHAnsi" w:hAnsiTheme="majorHAnsi"/>
+          <w:sz w:val="24"/>
+          <w:szCs w:val="24"/>
           <w:lang w:val="en-GB"/>
         </w:rPr>
         <w:t>@Lob</w:t>
       </w:r>
+      <w:r>
+        <w:rPr>
+          <w:rFonts w:asciiTheme="majorHAnsi" w:hAnsiTheme="majorHAnsi"/>
+          <w:sz w:val="24"/>
+          <w:szCs w:val="24"/>
+          <w:lang w:val="en-GB"/>
+        </w:rPr>
+        <w:t xml:space="preserve"> :</w:t>
+      </w:r>
+      <w:proofErr w:type="gramEnd"/>
+      <w:r>
+        <w:rPr>
+          <w:rFonts w:asciiTheme="majorHAnsi" w:hAnsiTheme="majorHAnsi"/>
+          <w:sz w:val="24"/>
+          <w:szCs w:val="24"/>
+          <w:lang w:val="en-GB"/>
+        </w:rPr>
+        <w:t xml:space="preserve"> Tells hibernate that it is large object not simple object.</w:t>
+      </w:r>
     </w:p>
     <w:p>
       <w:pPr>
@@ -891,11 +3108,17 @@
           <w:numId w:val="4"/>
         </w:numPr>
         <w:rPr>
-          <w:lang w:val="en-GB"/>
-        </w:rPr>
-      </w:pPr>
-      <w:r>
-        <w:rPr>
+          <w:rFonts w:asciiTheme="majorHAnsi" w:hAnsiTheme="majorHAnsi"/>
+          <w:sz w:val="24"/>
+          <w:szCs w:val="24"/>
+          <w:lang w:val="en-GB"/>
+        </w:rPr>
+      </w:pPr>
+      <w:r>
+        <w:rPr>
+          <w:rFonts w:asciiTheme="majorHAnsi" w:hAnsiTheme="majorHAnsi"/>
+          <w:sz w:val="24"/>
+          <w:szCs w:val="24"/>
           <w:lang w:val="en-GB"/>
         </w:rPr>
         <w:t>@</w:t>
@@ -903,6 +3126,9 @@
       <w:proofErr w:type="spellStart"/>
       <w:r>
         <w:rPr>
+          <w:rFonts w:asciiTheme="majorHAnsi" w:hAnsiTheme="majorHAnsi"/>
+          <w:sz w:val="24"/>
+          <w:szCs w:val="24"/>
           <w:lang w:val="en-GB"/>
         </w:rPr>
         <w:t>OneToOne</w:t>
@@ -917,15 +3143,141 @@
           <w:numId w:val="4"/>
         </w:numPr>
         <w:rPr>
-          <w:lang w:val="en-GB"/>
-        </w:rPr>
-      </w:pPr>
-      <w:r>
-        <w:rPr>
+          <w:rFonts w:asciiTheme="majorHAnsi" w:hAnsiTheme="majorHAnsi"/>
+          <w:sz w:val="24"/>
+          <w:szCs w:val="24"/>
+          <w:lang w:val="en-GB"/>
+        </w:rPr>
+      </w:pPr>
+      <w:proofErr w:type="gramStart"/>
+      <w:r>
+        <w:rPr>
+          <w:rFonts w:asciiTheme="majorHAnsi" w:hAnsiTheme="majorHAnsi"/>
+          <w:sz w:val="24"/>
+          <w:szCs w:val="24"/>
+          <w:lang w:val="en-GB"/>
+        </w:rPr>
+        <w:t>@Query(</w:t>
+      </w:r>
+      <w:proofErr w:type="gramEnd"/>
+      <w:r>
+        <w:rPr>
+          <w:rFonts w:asciiTheme="majorHAnsi" w:hAnsiTheme="majorHAnsi"/>
+          <w:sz w:val="24"/>
+          <w:szCs w:val="24"/>
+          <w:lang w:val="en-GB"/>
+        </w:rPr>
+        <w:t xml:space="preserve">value = "SQL Query", </w:t>
+      </w:r>
+      <w:proofErr w:type="spellStart"/>
+      <w:r>
+        <w:rPr>
+          <w:rFonts w:asciiTheme="majorHAnsi" w:hAnsiTheme="majorHAnsi"/>
+          <w:sz w:val="24"/>
+          <w:szCs w:val="24"/>
+          <w:lang w:val="en-GB"/>
+        </w:rPr>
+        <w:t>nativeQuery</w:t>
+      </w:r>
+      <w:proofErr w:type="spellEnd"/>
+      <w:r>
+        <w:rPr>
+          <w:rFonts w:asciiTheme="majorHAnsi" w:hAnsiTheme="majorHAnsi"/>
+          <w:sz w:val="24"/>
+          <w:szCs w:val="24"/>
+          <w:lang w:val="en-GB"/>
+        </w:rPr>
+        <w:t xml:space="preserve"> = true):- Used to fire </w:t>
+      </w:r>
+      <w:proofErr w:type="spellStart"/>
+      <w:r>
+        <w:rPr>
+          <w:rFonts w:asciiTheme="majorHAnsi" w:hAnsiTheme="majorHAnsi"/>
+          <w:sz w:val="24"/>
+          <w:szCs w:val="24"/>
+          <w:lang w:val="en-GB"/>
+        </w:rPr>
+        <w:t>sql</w:t>
+      </w:r>
+      <w:proofErr w:type="spellEnd"/>
+      <w:r>
+        <w:rPr>
+          <w:rFonts w:asciiTheme="majorHAnsi" w:hAnsiTheme="majorHAnsi"/>
+          <w:sz w:val="24"/>
+          <w:szCs w:val="24"/>
+          <w:lang w:val="en-GB"/>
+        </w:rPr>
+        <w:t xml:space="preserve"> query</w:t>
+      </w:r>
+      <w:r>
+        <w:rPr>
+          <w:rFonts w:asciiTheme="majorHAnsi" w:hAnsiTheme="majorHAnsi"/>
+          <w:sz w:val="24"/>
+          <w:szCs w:val="24"/>
+          <w:lang w:val="en-GB"/>
+        </w:rPr>
+        <w:t>.</w:t>
+      </w:r>
+    </w:p>
+    <w:p>
+      <w:pPr>
+        <w:pStyle w:val="ListParagraph"/>
+        <w:numPr>
+          <w:ilvl w:val="0"/>
+          <w:numId w:val="4"/>
+        </w:numPr>
+        <w:rPr>
+          <w:rFonts w:asciiTheme="majorHAnsi" w:hAnsiTheme="majorHAnsi"/>
+          <w:sz w:val="24"/>
+          <w:szCs w:val="24"/>
+          <w:lang w:val="en-GB"/>
+        </w:rPr>
+      </w:pPr>
+      <w:r>
+        <w:rPr>
+          <w:rFonts w:asciiTheme="majorHAnsi" w:hAnsiTheme="majorHAnsi"/>
+          <w:sz w:val="24"/>
+          <w:szCs w:val="24"/>
           <w:lang w:val="en-GB"/>
         </w:rPr>
         <w:t>@Table</w:t>
       </w:r>
+      <w:r>
+        <w:rPr>
+          <w:rFonts w:asciiTheme="majorHAnsi" w:hAnsiTheme="majorHAnsi"/>
+          <w:sz w:val="24"/>
+          <w:szCs w:val="24"/>
+          <w:lang w:val="en-GB"/>
+        </w:rPr>
+        <w:t xml:space="preserve">: </w:t>
+      </w:r>
+      <w:r>
+        <w:rPr>
+          <w:rFonts w:asciiTheme="majorHAnsi" w:hAnsiTheme="majorHAnsi"/>
+          <w:sz w:val="24"/>
+          <w:szCs w:val="24"/>
+          <w:lang w:val="en-GB"/>
+        </w:rPr>
+        <w:t>It is used to customize the database table settings associated with an entity.</w:t>
+      </w:r>
+      <w:r>
+        <w:rPr>
+          <w:rFonts w:asciiTheme="majorHAnsi" w:hAnsiTheme="majorHAnsi"/>
+          <w:sz w:val="24"/>
+          <w:szCs w:val="24"/>
+          <w:lang w:val="en-GB"/>
+        </w:rPr>
+        <w:t xml:space="preserve"> </w:t>
+      </w:r>
+      <w:r>
+        <w:rPr>
+          <w:rFonts w:asciiTheme="majorHAnsi" w:hAnsiTheme="majorHAnsi"/>
+          <w:sz w:val="24"/>
+          <w:szCs w:val="24"/>
+          <w:lang w:val="en-GB"/>
+        </w:rPr>
+        <w:t>When we use @Entity without specifying @Table, Hibernate will create a table with a name that matches the class name. See @Entity.</w:t>
+      </w:r>
     </w:p>
     <w:p>
       <w:pPr>
@@ -935,11 +3287,52 @@
           <w:numId w:val="4"/>
         </w:numPr>
         <w:rPr>
-          <w:lang w:val="en-GB"/>
-        </w:rPr>
-      </w:pPr>
-      <w:r>
-        <w:rPr>
+          <w:rFonts w:asciiTheme="majorHAnsi" w:hAnsiTheme="majorHAnsi"/>
+          <w:sz w:val="24"/>
+          <w:szCs w:val="24"/>
+          <w:lang w:val="en-GB"/>
+        </w:rPr>
+      </w:pPr>
+      <w:proofErr w:type="gramStart"/>
+      <w:r>
+        <w:rPr>
+          <w:rFonts w:asciiTheme="majorHAnsi" w:hAnsiTheme="majorHAnsi"/>
+          <w:sz w:val="24"/>
+          <w:szCs w:val="24"/>
+          <w:lang w:val="en-GB"/>
+        </w:rPr>
+        <w:t>@Temporal :</w:t>
+      </w:r>
+      <w:proofErr w:type="gramEnd"/>
+      <w:r>
+        <w:rPr>
+          <w:rFonts w:asciiTheme="majorHAnsi" w:hAnsiTheme="majorHAnsi"/>
+          <w:sz w:val="24"/>
+          <w:szCs w:val="24"/>
+          <w:lang w:val="en-GB"/>
+        </w:rPr>
+        <w:t xml:space="preserve"> Used with date field to tell hibernate the format in which the date needs to be saved.</w:t>
+      </w:r>
+    </w:p>
+    <w:p>
+      <w:pPr>
+        <w:pStyle w:val="ListParagraph"/>
+        <w:numPr>
+          <w:ilvl w:val="0"/>
+          <w:numId w:val="4"/>
+        </w:numPr>
+        <w:rPr>
+          <w:rFonts w:asciiTheme="majorHAnsi" w:hAnsiTheme="majorHAnsi"/>
+          <w:sz w:val="24"/>
+          <w:szCs w:val="24"/>
+          <w:lang w:val="en-GB"/>
+        </w:rPr>
+      </w:pPr>
+      <w:r>
+        <w:rPr>
+          <w:rFonts w:asciiTheme="majorHAnsi" w:hAnsiTheme="majorHAnsi"/>
+          <w:sz w:val="24"/>
+          <w:szCs w:val="24"/>
           <w:lang w:val="en-GB"/>
         </w:rPr>
         <w:t>@Transactional</w:t>
@@ -953,15 +3346,39 @@
           <w:numId w:val="4"/>
         </w:numPr>
         <w:rPr>
-          <w:lang w:val="en-GB"/>
-        </w:rPr>
-      </w:pPr>
-      <w:r>
-        <w:rPr>
+          <w:rFonts w:asciiTheme="majorHAnsi" w:hAnsiTheme="majorHAnsi"/>
+          <w:sz w:val="24"/>
+          <w:szCs w:val="24"/>
+          <w:lang w:val="en-GB"/>
+        </w:rPr>
+      </w:pPr>
+      <w:r>
+        <w:rPr>
+          <w:rFonts w:asciiTheme="majorHAnsi" w:hAnsiTheme="majorHAnsi"/>
+          <w:sz w:val="24"/>
+          <w:szCs w:val="24"/>
           <w:lang w:val="en-GB"/>
         </w:rPr>
         <w:t>@Transient</w:t>
       </w:r>
+      <w:r>
+        <w:rPr>
+          <w:rFonts w:asciiTheme="majorHAnsi" w:hAnsiTheme="majorHAnsi"/>
+          <w:sz w:val="24"/>
+          <w:szCs w:val="24"/>
+          <w:lang w:val="en-GB"/>
+        </w:rPr>
+        <w:t xml:space="preserve">: </w:t>
+      </w:r>
+      <w:r>
+        <w:rPr>
+          <w:rFonts w:asciiTheme="majorHAnsi" w:hAnsiTheme="majorHAnsi"/>
+          <w:sz w:val="24"/>
+          <w:szCs w:val="24"/>
+          <w:lang w:val="en-GB"/>
+        </w:rPr>
+        <w:t>tells hibernate not to save this field</w:t>
+      </w:r>
     </w:p>
     <w:p>
       <w:pPr>
@@ -971,11 +3388,17 @@
           <w:numId w:val="4"/>
         </w:numPr>
         <w:rPr>
-          <w:lang w:val="en-GB"/>
-        </w:rPr>
-      </w:pPr>
-      <w:r>
-        <w:rPr>
+          <w:rFonts w:asciiTheme="majorHAnsi" w:hAnsiTheme="majorHAnsi"/>
+          <w:sz w:val="24"/>
+          <w:szCs w:val="24"/>
+          <w:lang w:val="en-GB"/>
+        </w:rPr>
+      </w:pPr>
+      <w:r>
+        <w:rPr>
+          <w:rFonts w:asciiTheme="majorHAnsi" w:hAnsiTheme="majorHAnsi"/>
+          <w:sz w:val="24"/>
+          <w:szCs w:val="24"/>
           <w:lang w:val="en-GB"/>
         </w:rPr>
         <w:t>@</w:t>
@@ -983,6 +3406,9 @@
       <w:proofErr w:type="spellStart"/>
       <w:r>
         <w:rPr>
+          <w:rFonts w:asciiTheme="majorHAnsi" w:hAnsiTheme="majorHAnsi"/>
+          <w:sz w:val="24"/>
+          <w:szCs w:val="24"/>
           <w:lang w:val="en-GB"/>
         </w:rPr>
         <w:t>UpdateTimeStamp</w:t>
@@ -1004,17 +3430,17 @@
   <w:abstractNum w:abstractNumId="0">
     <w:nsid w:val="01F136D6"/>
     <w:multiLevelType w:val="hybridMultilevel"/>
-    <w:tmpl w:val="032CF89A"/>
-    <w:lvl w:ilvl="0" w:tplc="04090001">
+    <w:tmpl w:val="E7346714"/>
+    <w:lvl w:ilvl="0" w:tplc="0409000F">
       <w:start w:val="1"/>
-      <w:numFmt w:val="bullet"/>
-      <w:lvlText w:val=""/>
+      <w:numFmt w:val="decimal"/>
+      <w:lvlText w:val="%1."/>
       <w:lvlJc w:val="left"/>
       <w:pPr>
         <w:ind w:left="720" w:hanging="360"/>
       </w:pPr>
       <w:rPr>
-        <w:rFonts w:ascii="Symbol" w:hAnsi="Symbol" w:hint="default"/>
+        <w:rFonts w:hint="default"/>
       </w:rPr>
     </w:lvl>
     <w:lvl w:ilvl="1" w:tplc="04090019" w:tentative="1">

</xml_diff>